<commit_message>
Added No tollkit Project
</commit_message>
<xml_diff>
--- a/CUP697_Euler-AjayiO.docx
+++ b/CUP697_Euler-AjayiO.docx
@@ -1,6 +1,6 @@
 
 <file path=word/document.xml><?xml version="1.0" encoding="utf-8"?>
-<w:document xmlns:wpc="http://schemas.microsoft.com/office/word/2010/wordprocessingCanvas" xmlns:cx="http://schemas.microsoft.com/office/drawing/2014/chartex" xmlns:cx1="http://schemas.microsoft.com/office/drawing/2015/9/8/chartex" xmlns:cx2="http://schemas.microsoft.com/office/drawing/2015/10/21/chartex" xmlns:cx3="http://schemas.microsoft.com/office/drawing/2016/5/9/chartex" xmlns:cx4="http://schemas.microsoft.com/office/drawing/2016/5/10/chartex" xmlns:cx5="http://schemas.microsoft.com/office/drawing/2016/5/11/chartex" xmlns:cx6="http://schemas.microsoft.com/office/drawing/2016/5/12/chartex" xmlns:cx7="http://schemas.microsoft.com/office/drawing/2016/5/13/chartex" xmlns:cx8="http://schemas.microsoft.com/office/drawing/2016/5/14/chartex" xmlns:mc="http://schemas.openxmlformats.org/markup-compatibility/2006" xmlns:aink="http://schemas.microsoft.com/office/drawing/2016/ink" xmlns:am3d="http://schemas.microsoft.com/office/drawing/2017/model3d" xmlns:o="urn:schemas-microsoft-com:office:office" xmlns:oel="http://schemas.microsoft.com/office/2019/extlst" xmlns:r="http://schemas.openxmlformats.org/officeDocument/2006/relationships" xmlns:m="http://schemas.openxmlformats.org/officeDocument/2006/math" xmlns:v="urn:schemas-microsoft-com:vml" xmlns:wp14="http://schemas.microsoft.com/office/word/2010/wordprocessingDrawing" xmlns:wp="http://schemas.openxmlformats.org/drawingml/2006/wordprocessingDrawing" xmlns:w10="urn:schemas-microsoft-com:office:word" xmlns:w="http://schemas.openxmlformats.org/wordprocessingml/2006/main" xmlns:w14="http://schemas.microsoft.com/office/word/2010/wordml" xmlns:w15="http://schemas.microsoft.com/office/word/2012/wordml" xmlns:w16cex="http://schemas.microsoft.com/office/word/2018/wordml/cex" xmlns:w16cid="http://schemas.microsoft.com/office/word/2016/wordml/cid" xmlns:w16="http://schemas.microsoft.com/office/word/2018/wordml" xmlns:w16du="http://schemas.microsoft.com/office/word/2023/wordml/word16du" xmlns:w16sdtdh="http://schemas.microsoft.com/office/word/2020/wordml/sdtdatahash" xmlns:w16se="http://schemas.microsoft.com/office/word/2015/wordml/symex" xmlns:wpg="http://schemas.microsoft.com/office/word/2010/wordprocessingGroup" xmlns:wpi="http://schemas.microsoft.com/office/word/2010/wordprocessingInk" xmlns:wne="http://schemas.microsoft.com/office/word/2006/wordml" xmlns:wps="http://schemas.microsoft.com/office/word/2010/wordprocessingShape" mc:Ignorable="w14 w15 w16se w16cid w16 w16cex w16sdtdh w16du wp14">
+<w:document xmlns:wpc="http://schemas.microsoft.com/office/word/2010/wordprocessingCanvas" xmlns:cx="http://schemas.microsoft.com/office/drawing/2014/chartex" xmlns:cx1="http://schemas.microsoft.com/office/drawing/2015/9/8/chartex" xmlns:cx2="http://schemas.microsoft.com/office/drawing/2015/10/21/chartex" xmlns:cx3="http://schemas.microsoft.com/office/drawing/2016/5/9/chartex" xmlns:cx4="http://schemas.microsoft.com/office/drawing/2016/5/10/chartex" xmlns:cx5="http://schemas.microsoft.com/office/drawing/2016/5/11/chartex" xmlns:cx6="http://schemas.microsoft.com/office/drawing/2016/5/12/chartex" xmlns:cx7="http://schemas.microsoft.com/office/drawing/2016/5/13/chartex" xmlns:cx8="http://schemas.microsoft.com/office/drawing/2016/5/14/chartex" xmlns:mc="http://schemas.openxmlformats.org/markup-compatibility/2006" xmlns:aink="http://schemas.microsoft.com/office/drawing/2016/ink" xmlns:am3d="http://schemas.microsoft.com/office/drawing/2017/model3d" xmlns:o="urn:schemas-microsoft-com:office:office" xmlns:oel="http://schemas.microsoft.com/office/2019/extlst" xmlns:r="http://schemas.openxmlformats.org/officeDocument/2006/relationships" xmlns:m="http://schemas.openxmlformats.org/officeDocument/2006/math" xmlns:v="urn:schemas-microsoft-com:vml" xmlns:wp14="http://schemas.microsoft.com/office/word/2010/wordprocessingDrawing" xmlns:wp="http://schemas.openxmlformats.org/drawingml/2006/wordprocessingDrawing" xmlns:w10="urn:schemas-microsoft-com:office:word" xmlns:w="http://schemas.openxmlformats.org/wordprocessingml/2006/main" xmlns:w14="http://schemas.microsoft.com/office/word/2010/wordml" xmlns:w15="http://schemas.microsoft.com/office/word/2012/wordml" xmlns:w16cex="http://schemas.microsoft.com/office/word/2018/wordml/cex" xmlns:w16cid="http://schemas.microsoft.com/office/word/2016/wordml/cid" xmlns:w16="http://schemas.microsoft.com/office/word/2018/wordml" xmlns:w16du="http://schemas.microsoft.com/office/word/2023/wordml/word16du" xmlns:w16sdtdh="http://schemas.microsoft.com/office/word/2020/wordml/sdtdatahash" xmlns:w16sdtfl="http://schemas.microsoft.com/office/word/2024/wordml/sdtformatlock" xmlns:w16se="http://schemas.microsoft.com/office/word/2015/wordml/symex" xmlns:wpg="http://schemas.microsoft.com/office/word/2010/wordprocessingGroup" xmlns:wpi="http://schemas.microsoft.com/office/word/2010/wordprocessingInk" xmlns:wne="http://schemas.microsoft.com/office/word/2006/wordml" xmlns:wps="http://schemas.microsoft.com/office/word/2010/wordprocessingShape" mc:Ignorable="w14 w15 w16se w16cid w16 w16cex w16sdtdh w16sdtfl w16du wp14">
   <w:body>
     <w:tbl>
       <w:tblPr>
@@ -63,7 +63,7 @@
                 <w:lang w:val="en-GB"/>
               </w:rPr>
             </w:pPr>
-            <w:bookmarkStart w:id="0" w:name="_Toc189602840"/>
+            <w:bookmarkStart w:id="0" w:name="_Toc189647764"/>
             <w:r>
               <w:rPr>
                 <w:noProof/>
@@ -346,7 +346,7 @@
                 </mc:Choice>
                 <mc:Fallback>
                   <w:pict>
-                    <v:group w14:anchorId="64D3A8B3" id="Group 1" o:spid="_x0000_s1026" alt="&quot;&quot;" style="position:absolute;margin-left:-35.4pt;margin-top:-176.9pt;width:612pt;height:841.5pt;z-index:-251654656;mso-position-horizontal-relative:margin;mso-position-vertical-relative:page;mso-width-relative:margin;mso-height-relative:margin" coordsize="77711,100533" o:gfxdata="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">
+                    <v:group w14:anchorId="5DBE38F3" id="Group 1" o:spid="_x0000_s1026" alt="&quot;&quot;" style="position:absolute;margin-left:-35.4pt;margin-top:-176.9pt;width:612pt;height:841.5pt;z-index:-251654656;mso-position-horizontal-relative:margin;mso-position-vertical-relative:page;mso-width-relative:margin;mso-height-relative:margin" coordsize="77711,100533" o:gfxdata="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">
                       <v:shape id="Shape" o:spid="_x0000_s1027" style="position:absolute;top:25527;width:58458;height:75006;visibility:visible;mso-wrap-style:square;v-text-anchor:middle" coordsize="21600,21600" o:gfxdata="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" path="m,10687l,21600r1769,l21600,6148,13712,,,10687xe" fillcolor="#d8d8d8 [2732]" stroked="f" strokeweight="1pt">
                         <v:stroke miterlimit="4" joinstyle="miter"/>
                         <v:path arrowok="t" o:extrusionok="f" o:connecttype="custom" o:connectlocs="2922906,3750311;2922906,3750311;2922906,3750311;2922906,3750311" o:connectangles="0,90,180,270"/>
@@ -679,7 +679,7 @@
                 <w:lang w:val="en-GB"/>
               </w:rPr>
             </w:pPr>
-            <w:bookmarkStart w:id="1" w:name="_Toc189602841"/>
+            <w:bookmarkStart w:id="1" w:name="_Toc189647765"/>
             <w:r>
               <w:rPr>
                 <w:noProof/>
@@ -700,6 +700,12 @@
           </w:p>
           <w:sdt>
             <w:sdtPr>
+              <w:rPr>
+                <w:rFonts w:asciiTheme="minorHAnsi" w:eastAsiaTheme="minorHAnsi" w:hAnsiTheme="minorHAnsi" w:cstheme="minorBidi"/>
+                <w:color w:val="auto"/>
+                <w:sz w:val="24"/>
+                <w:szCs w:val="24"/>
+              </w:rPr>
               <w:id w:val="-1056854134"/>
               <w:docPartObj>
                 <w:docPartGallery w:val="Table of Contents"/>
@@ -708,12 +714,8 @@
             </w:sdtPr>
             <w:sdtEndPr>
               <w:rPr>
-                <w:rFonts w:asciiTheme="minorHAnsi" w:eastAsiaTheme="minorHAnsi" w:hAnsiTheme="minorHAnsi" w:cstheme="minorBidi"/>
                 <w:b/>
                 <w:bCs/>
-                <w:color w:val="auto"/>
-                <w:sz w:val="24"/>
-                <w:szCs w:val="24"/>
               </w:rPr>
             </w:sdtEndPr>
             <w:sdtContent>
@@ -751,7 +753,7 @@
                 <w:r>
                   <w:fldChar w:fldCharType="separate"/>
                 </w:r>
-                <w:hyperlink w:anchor="_Toc189602840" w:history="1">
+                <w:hyperlink w:anchor="_Toc189647764" w:history="1">
                   <w:r>
                     <w:rPr>
                       <w:rStyle w:val="Hyperlink"/>
@@ -779,7 +781,7 @@
                       <w:noProof/>
                       <w:webHidden/>
                     </w:rPr>
-                    <w:instrText xml:space="preserve"> PAGEREF _Toc189602840 \h </w:instrText>
+                    <w:instrText xml:space="preserve"> PAGEREF _Toc189647764 \h </w:instrText>
                   </w:r>
                   <w:r>
                     <w:rPr>
@@ -824,7 +826,7 @@
                     <w14:ligatures w14:val="standardContextual"/>
                   </w:rPr>
                 </w:pPr>
-                <w:hyperlink w:anchor="_Toc189602841" w:history="1">
+                <w:hyperlink w:anchor="_Toc189647765" w:history="1">
                   <w:r>
                     <w:rPr>
                       <w:rStyle w:val="Hyperlink"/>
@@ -852,7 +854,7 @@
                       <w:noProof/>
                       <w:webHidden/>
                     </w:rPr>
-                    <w:instrText xml:space="preserve"> PAGEREF _Toc189602841 \h </w:instrText>
+                    <w:instrText xml:space="preserve"> PAGEREF _Toc189647765 \h </w:instrText>
                   </w:r>
                   <w:r>
                     <w:rPr>
@@ -897,7 +899,7 @@
                     <w14:ligatures w14:val="standardContextual"/>
                   </w:rPr>
                 </w:pPr>
-                <w:hyperlink w:anchor="_Toc189602842" w:history="1">
+                <w:hyperlink w:anchor="_Toc189647766" w:history="1">
                   <w:r>
                     <w:rPr>
                       <w:rStyle w:val="Hyperlink"/>
@@ -926,7 +928,7 @@
                       <w:noProof/>
                       <w:webHidden/>
                     </w:rPr>
-                    <w:instrText xml:space="preserve"> PAGEREF _Toc189602842 \h </w:instrText>
+                    <w:instrText xml:space="preserve"> PAGEREF _Toc189647766 \h </w:instrText>
                   </w:r>
                   <w:r>
                     <w:rPr>
@@ -971,7 +973,7 @@
                     <w14:ligatures w14:val="standardContextual"/>
                   </w:rPr>
                 </w:pPr>
-                <w:hyperlink w:anchor="_Toc189602843" w:history="1">
+                <w:hyperlink w:anchor="_Toc189647767" w:history="1">
                   <w:r>
                     <w:rPr>
                       <w:rStyle w:val="Hyperlink"/>
@@ -998,7 +1000,152 @@
                       <w:noProof/>
                       <w:webHidden/>
                     </w:rPr>
-                    <w:instrText xml:space="preserve"> PAGEREF _Toc189602843 \h </w:instrText>
+                    <w:instrText xml:space="preserve"> PAGEREF _Toc189647767 \h </w:instrText>
+                  </w:r>
+                  <w:r>
+                    <w:rPr>
+                      <w:noProof/>
+                      <w:webHidden/>
+                    </w:rPr>
+                  </w:r>
+                  <w:r>
+                    <w:rPr>
+                      <w:noProof/>
+                      <w:webHidden/>
+                    </w:rPr>
+                    <w:fldChar w:fldCharType="separate"/>
+                  </w:r>
+                  <w:r>
+                    <w:rPr>
+                      <w:noProof/>
+                      <w:webHidden/>
+                    </w:rPr>
+                    <w:t>5</w:t>
+                  </w:r>
+                  <w:r>
+                    <w:rPr>
+                      <w:noProof/>
+                      <w:webHidden/>
+                    </w:rPr>
+                    <w:fldChar w:fldCharType="end"/>
+                  </w:r>
+                </w:hyperlink>
+              </w:p>
+              <w:p>
+                <w:pPr>
+                  <w:pStyle w:val="TOC2"/>
+                  <w:tabs>
+                    <w:tab w:val="right" w:leader="dot" w:pos="10648"/>
+                  </w:tabs>
+                  <w:rPr>
+                    <w:rFonts w:eastAsiaTheme="minorEastAsia"/>
+                    <w:noProof/>
+                    <w:kern w:val="2"/>
+                    <w:lang w:val="en-GB" w:eastAsia="en-GB"/>
+                    <w14:ligatures w14:val="standardContextual"/>
+                  </w:rPr>
+                </w:pPr>
+                <w:hyperlink w:anchor="_Toc189647768" w:history="1">
+                  <w:r>
+                    <w:rPr>
+                      <w:rStyle w:val="Hyperlink"/>
+                      <w:noProof/>
+                    </w:rPr>
+                    <w:t>Aim of the Project</w:t>
+                  </w:r>
+                  <w:r>
+                    <w:rPr>
+                      <w:noProof/>
+                      <w:webHidden/>
+                    </w:rPr>
+                    <w:tab/>
+                  </w:r>
+                  <w:r>
+                    <w:rPr>
+                      <w:noProof/>
+                      <w:webHidden/>
+                    </w:rPr>
+                    <w:fldChar w:fldCharType="begin"/>
+                  </w:r>
+                  <w:r>
+                    <w:rPr>
+                      <w:noProof/>
+                      <w:webHidden/>
+                    </w:rPr>
+                    <w:instrText xml:space="preserve"> PAGEREF _Toc189647768 \h </w:instrText>
+                  </w:r>
+                  <w:r>
+                    <w:rPr>
+                      <w:noProof/>
+                      <w:webHidden/>
+                    </w:rPr>
+                  </w:r>
+                  <w:r>
+                    <w:rPr>
+                      <w:noProof/>
+                      <w:webHidden/>
+                    </w:rPr>
+                    <w:fldChar w:fldCharType="separate"/>
+                  </w:r>
+                  <w:r>
+                    <w:rPr>
+                      <w:noProof/>
+                      <w:webHidden/>
+                    </w:rPr>
+                    <w:t>5</w:t>
+                  </w:r>
+                  <w:r>
+                    <w:rPr>
+                      <w:noProof/>
+                      <w:webHidden/>
+                    </w:rPr>
+                    <w:fldChar w:fldCharType="end"/>
+                  </w:r>
+                </w:hyperlink>
+              </w:p>
+              <w:p>
+                <w:pPr>
+                  <w:pStyle w:val="TOC2"/>
+                  <w:tabs>
+                    <w:tab w:val="right" w:leader="dot" w:pos="10648"/>
+                  </w:tabs>
+                  <w:rPr>
+                    <w:rFonts w:eastAsiaTheme="minorEastAsia"/>
+                    <w:noProof/>
+                    <w:kern w:val="2"/>
+                    <w:lang w:val="en-GB" w:eastAsia="en-GB"/>
+                    <w14:ligatures w14:val="standardContextual"/>
+                  </w:rPr>
+                </w:pPr>
+                <w:hyperlink w:anchor="_Toc189647769" w:history="1">
+                  <w:r>
+                    <w:rPr>
+                      <w:rStyle w:val="Hyperlink"/>
+                      <w:noProof/>
+                      <w:lang w:val="en-GB"/>
+                    </w:rPr>
+                    <w:t>Project Objectives</w:t>
+                  </w:r>
+                  <w:r>
+                    <w:rPr>
+                      <w:noProof/>
+                      <w:webHidden/>
+                    </w:rPr>
+                    <w:tab/>
+                  </w:r>
+                  <w:r>
+                    <w:rPr>
+                      <w:noProof/>
+                      <w:webHidden/>
+                    </w:rPr>
+                    <w:fldChar w:fldCharType="begin"/>
+                  </w:r>
+                  <w:r>
+                    <w:rPr>
+                      <w:noProof/>
+                      <w:webHidden/>
+                    </w:rPr>
+                    <w:instrText xml:space="preserve"> PAGEREF _Toc189647769 \h </w:instrText>
                   </w:r>
                   <w:r>
                     <w:rPr>
@@ -1043,7 +1190,7 @@
                     <w14:ligatures w14:val="standardContextual"/>
                   </w:rPr>
                 </w:pPr>
-                <w:hyperlink w:anchor="_Toc189602844" w:history="1">
+                <w:hyperlink w:anchor="_Toc189647770" w:history="1">
                   <w:r>
                     <w:rPr>
                       <w:rStyle w:val="Hyperlink"/>
@@ -1051,7 +1198,7 @@
                       <w:noProof/>
                       <w:lang w:val="en-GB"/>
                     </w:rPr>
-                    <w:t>What is VR</w:t>
+                    <w:t>Stretch Goals</w:t>
                   </w:r>
                   <w:r>
                     <w:rPr>
@@ -1072,72 +1219,7 @@
                       <w:noProof/>
                       <w:webHidden/>
                     </w:rPr>
-                    <w:instrText xml:space="preserve"> PAGEREF _Toc189602844 \h </w:instrText>
-                  </w:r>
-                  <w:r>
-                    <w:rPr>
-                      <w:noProof/>
-                      <w:webHidden/>
-                    </w:rPr>
-                  </w:r>
-                  <w:r>
-                    <w:rPr>
-                      <w:noProof/>
-                      <w:webHidden/>
-                    </w:rPr>
-                    <w:fldChar w:fldCharType="separate"/>
-                  </w:r>
-                  <w:r>
-                    <w:rPr>
-                      <w:noProof/>
-                      <w:webHidden/>
-                    </w:rPr>
-                    <w:t>5</w:t>
-                  </w:r>
-                  <w:r>
-                    <w:rPr>
-                      <w:noProof/>
-                      <w:webHidden/>
-                    </w:rPr>
-                    <w:fldChar w:fldCharType="end"/>
-                  </w:r>
-                </w:hyperlink>
-              </w:p>
-              <w:p>
-                <w:pPr>
-                  <w:pStyle w:val="TOC1"/>
-                  <w:tabs>
-                    <w:tab w:val="right" w:leader="dot" w:pos="10648"/>
-                  </w:tabs>
-                  <w:rPr>
-                    <w:rFonts w:eastAsiaTheme="minorEastAsia"/>
-                    <w:noProof/>
-                    <w:kern w:val="2"/>
-                    <w:lang w:val="en-GB" w:eastAsia="en-GB"/>
-                    <w14:ligatures w14:val="standardContextual"/>
-                  </w:rPr>
-                </w:pPr>
-                <w:hyperlink w:anchor="_Toc189602845" w:history="1">
-                  <w:r>
-                    <w:rPr>
-                      <w:noProof/>
-                      <w:webHidden/>
-                    </w:rPr>
-                    <w:tab/>
-                  </w:r>
-                  <w:r>
-                    <w:rPr>
-                      <w:noProof/>
-                      <w:webHidden/>
-                    </w:rPr>
-                    <w:fldChar w:fldCharType="begin"/>
-                  </w:r>
-                  <w:r>
-                    <w:rPr>
-                      <w:noProof/>
-                      <w:webHidden/>
-                    </w:rPr>
-                    <w:instrText xml:space="preserve"> PAGEREF _Toc189602845 \h </w:instrText>
+                    <w:instrText xml:space="preserve"> PAGEREF _Toc189647770 \h </w:instrText>
                   </w:r>
                   <w:r>
                     <w:rPr>
@@ -1182,14 +1264,14 @@
                     <w14:ligatures w14:val="standardContextual"/>
                   </w:rPr>
                 </w:pPr>
-                <w:hyperlink w:anchor="_Toc189602846" w:history="1">
+                <w:hyperlink w:anchor="_Toc189647771" w:history="1">
                   <w:r>
                     <w:rPr>
                       <w:rStyle w:val="Hyperlink"/>
                       <w:noProof/>
                       <w:lang w:val="en-GB"/>
                     </w:rPr>
-                    <w:t>References</w:t>
+                    <w:t>Pre-production Research</w:t>
                   </w:r>
                   <w:r>
                     <w:rPr>
@@ -1210,7 +1292,7 @@
                       <w:noProof/>
                       <w:webHidden/>
                     </w:rPr>
-                    <w:instrText xml:space="preserve"> PAGEREF _Toc189602846 \h </w:instrText>
+                    <w:instrText xml:space="preserve"> PAGEREF _Toc189647771 \h </w:instrText>
                   </w:r>
                   <w:r>
                     <w:rPr>
@@ -1255,7 +1337,80 @@
                     <w14:ligatures w14:val="standardContextual"/>
                   </w:rPr>
                 </w:pPr>
-                <w:hyperlink w:anchor="_Toc189602847" w:history="1">
+                <w:hyperlink w:anchor="_Toc189647772" w:history="1">
+                  <w:r>
+                    <w:rPr>
+                      <w:rStyle w:val="Hyperlink"/>
+                      <w:noProof/>
+                      <w:lang w:val="en-GB"/>
+                    </w:rPr>
+                    <w:t>Project Scope</w:t>
+                  </w:r>
+                  <w:r>
+                    <w:rPr>
+                      <w:noProof/>
+                      <w:webHidden/>
+                    </w:rPr>
+                    <w:tab/>
+                  </w:r>
+                  <w:r>
+                    <w:rPr>
+                      <w:noProof/>
+                      <w:webHidden/>
+                    </w:rPr>
+                    <w:fldChar w:fldCharType="begin"/>
+                  </w:r>
+                  <w:r>
+                    <w:rPr>
+                      <w:noProof/>
+                      <w:webHidden/>
+                    </w:rPr>
+                    <w:instrText xml:space="preserve"> PAGEREF _Toc189647772 \h </w:instrText>
+                  </w:r>
+                  <w:r>
+                    <w:rPr>
+                      <w:noProof/>
+                      <w:webHidden/>
+                    </w:rPr>
+                  </w:r>
+                  <w:r>
+                    <w:rPr>
+                      <w:noProof/>
+                      <w:webHidden/>
+                    </w:rPr>
+                    <w:fldChar w:fldCharType="separate"/>
+                  </w:r>
+                  <w:r>
+                    <w:rPr>
+                      <w:noProof/>
+                      <w:webHidden/>
+                    </w:rPr>
+                    <w:t>6</w:t>
+                  </w:r>
+                  <w:r>
+                    <w:rPr>
+                      <w:noProof/>
+                      <w:webHidden/>
+                    </w:rPr>
+                    <w:fldChar w:fldCharType="end"/>
+                  </w:r>
+                </w:hyperlink>
+              </w:p>
+              <w:p>
+                <w:pPr>
+                  <w:pStyle w:val="TOC1"/>
+                  <w:tabs>
+                    <w:tab w:val="right" w:leader="dot" w:pos="10648"/>
+                  </w:tabs>
+                  <w:rPr>
+                    <w:rFonts w:eastAsiaTheme="minorEastAsia"/>
+                    <w:noProof/>
+                    <w:kern w:val="2"/>
+                    <w:lang w:val="en-GB" w:eastAsia="en-GB"/>
+                    <w14:ligatures w14:val="standardContextual"/>
+                  </w:rPr>
+                </w:pPr>
+                <w:hyperlink w:anchor="_Toc189647773" w:history="1">
                   <w:r>
                     <w:rPr>
                       <w:rStyle w:val="Hyperlink"/>
@@ -1283,7 +1438,7 @@
                       <w:noProof/>
                       <w:webHidden/>
                     </w:rPr>
-                    <w:instrText xml:space="preserve"> PAGEREF _Toc189602847 \h </w:instrText>
+                    <w:instrText xml:space="preserve"> PAGEREF _Toc189647773 \h </w:instrText>
                   </w:r>
                   <w:r>
                     <w:rPr>
@@ -1352,7 +1507,7 @@
       </w:tr>
       <w:tr>
         <w:trPr>
-          <w:trHeight w:val="9241"/>
+          <w:trHeight w:val="5387"/>
         </w:trPr>
         <w:tc>
           <w:tcPr>
@@ -1583,7 +1738,7 @@
                 <w:lang w:val="en-GB"/>
               </w:rPr>
             </w:pPr>
-            <w:bookmarkStart w:id="2" w:name="_Toc189602842"/>
+            <w:bookmarkStart w:id="2" w:name="_Toc189647766"/>
             <w:r>
               <w:rPr>
                 <w:rStyle w:val="Emphasis"/>
@@ -2186,7 +2341,7 @@
             <w:pPr>
               <w:pStyle w:val="Heading1"/>
             </w:pPr>
-            <w:bookmarkStart w:id="3" w:name="_Toc189602843"/>
+            <w:bookmarkStart w:id="3" w:name="_Toc189647767"/>
             <w:r>
               <w:t>Project Definition</w:t>
             </w:r>
@@ -2196,9 +2351,11 @@
             <w:pPr>
               <w:pStyle w:val="Heading2"/>
             </w:pPr>
+            <w:bookmarkStart w:id="4" w:name="_Toc189647768"/>
             <w:r>
               <w:t>Aim of the Project</w:t>
             </w:r>
+            <w:bookmarkEnd w:id="4"/>
           </w:p>
           <w:p>
             <w:r>
@@ -2215,11 +2372,9 @@
             <w:r>
               <w:t xml:space="preserve">The project will implement a variety of features such as VR locomotion, object interaction, a </w:t>
             </w:r>
-            <w:proofErr w:type="spellStart"/>
-            <w:r>
-              <w:t>fullbody</w:t>
-            </w:r>
-            <w:proofErr w:type="spellEnd"/>
+            <w:r>
+              <w:t>full body</w:t>
+            </w:r>
             <w:r>
               <w:t xml:space="preserve"> representation of the player utilizing inverse kinematics and gesture recognition of the actions they may make, which will be utilized in activating various abilities.</w:t>
             </w:r>
@@ -2247,6 +2402,7 @@
                 <w:lang w:val="en-GB"/>
               </w:rPr>
             </w:pPr>
+            <w:bookmarkStart w:id="5" w:name="_Toc189647769"/>
             <w:r>
               <w:rPr>
                 <w:noProof/>
@@ -2254,6 +2410,7 @@
               </w:rPr>
               <w:t>Project Objectives</w:t>
             </w:r>
+            <w:bookmarkEnd w:id="5"/>
           </w:p>
           <w:p>
             <w:pPr>
@@ -2368,13 +2525,13 @@
               <w:rPr>
                 <w:lang w:val="en-GB"/>
               </w:rPr>
-              <w:t>– Allow the player to traverse the available area using read inputs from the controller</w:t>
-            </w:r>
-            <w:r>
-              <w:rPr>
-                <w:lang w:val="en-GB"/>
-              </w:rPr>
-              <w:t>, without moving in their physical plane of existence</w:t>
+              <w:t>– Allow the player to traverse the available area using inputs from the controller</w:t>
+            </w:r>
+            <w:r>
+              <w:rPr>
+                <w:lang w:val="en-GB"/>
+              </w:rPr>
+              <w:t>, without moving in their physical plane</w:t>
             </w:r>
             <w:r>
               <w:rPr>
@@ -2387,21 +2544,7 @@
                 <w:color w:val="9933FF"/>
                 <w:lang w:val="en-GB"/>
               </w:rPr>
-              <w:t xml:space="preserve">WC </w:t>
-            </w:r>
-            <w:r>
-              <w:rPr>
-                <w:color w:val="9933FF"/>
-                <w:lang w:val="en-GB"/>
-              </w:rPr>
-              <w:t>10</w:t>
-            </w:r>
-            <w:r>
-              <w:rPr>
-                <w:color w:val="9933FF"/>
-                <w:lang w:val="en-GB"/>
-              </w:rPr>
-              <w:t>/2</w:t>
+              <w:t>WC 10/2</w:t>
             </w:r>
           </w:p>
           <w:p>
@@ -2426,34 +2569,14 @@
               <w:rPr>
                 <w:lang w:val="en-GB"/>
               </w:rPr>
-              <w:t>– Allow the player to pick up, hover over, throw and punch objects in-game using their controllers.</w:t>
-            </w:r>
-            <w:r>
-              <w:rPr>
-                <w:lang w:val="en-GB"/>
-              </w:rPr>
-              <w:t xml:space="preserve"> </w:t>
+              <w:t xml:space="preserve">– Allow the player to pick up, hover over, throw and punch objects in-game using their controllers. </w:t>
             </w:r>
             <w:r>
               <w:rPr>
                 <w:color w:val="9933FF"/>
                 <w:lang w:val="en-GB"/>
               </w:rPr>
-              <w:t xml:space="preserve">WC </w:t>
-            </w:r>
-            <w:r>
-              <w:rPr>
-                <w:color w:val="9933FF"/>
-                <w:lang w:val="en-GB"/>
-              </w:rPr>
-              <w:t>17</w:t>
-            </w:r>
-            <w:r>
-              <w:rPr>
-                <w:color w:val="9933FF"/>
-                <w:lang w:val="en-GB"/>
-              </w:rPr>
-              <w:t>/2</w:t>
+              <w:t>WC 17/2</w:t>
             </w:r>
           </w:p>
           <w:p>
@@ -2491,7 +2614,7 @@
               <w:rPr>
                 <w:lang w:val="en-GB"/>
               </w:rPr>
-              <w:t xml:space="preserve"> Create UI that is appealing to use and easy to interact with in VR</w:t>
+              <w:t xml:space="preserve"> Create UI easy to interact with in VR</w:t>
             </w:r>
             <w:r>
               <w:rPr>
@@ -2505,21 +2628,7 @@
                 <w:color w:val="9933FF"/>
                 <w:lang w:val="en-GB"/>
               </w:rPr>
-              <w:t xml:space="preserve">WC </w:t>
-            </w:r>
-            <w:r>
-              <w:rPr>
-                <w:color w:val="9933FF"/>
-                <w:lang w:val="en-GB"/>
-              </w:rPr>
-              <w:t>24</w:t>
-            </w:r>
-            <w:r>
-              <w:rPr>
-                <w:color w:val="9933FF"/>
-                <w:lang w:val="en-GB"/>
-              </w:rPr>
-              <w:t>/2</w:t>
+              <w:t>WC 24/2</w:t>
             </w:r>
           </w:p>
           <w:p>
@@ -2544,7 +2653,31 @@
               <w:rPr>
                 <w:lang w:val="en-GB"/>
               </w:rPr>
-              <w:t>– Program a means of saving and loading settings such as volume, whilst finding solutions to problems such as motion sickness for certain users</w:t>
+              <w:t xml:space="preserve">– Program a means of saving and loading settings such </w:t>
+            </w:r>
+            <w:r>
+              <w:rPr>
+                <w:lang w:val="en-GB"/>
+              </w:rPr>
+              <w:t>locomotion settings</w:t>
+            </w:r>
+            <w:r>
+              <w:rPr>
+                <w:lang w:val="en-GB"/>
+              </w:rPr>
+              <w:t xml:space="preserve">, whilst </w:t>
+            </w:r>
+            <w:r>
+              <w:rPr>
+                <w:lang w:val="en-GB"/>
+              </w:rPr>
+              <w:t>providing options for users</w:t>
+            </w:r>
+            <w:r>
+              <w:rPr>
+                <w:lang w:val="en-GB"/>
+              </w:rPr>
+              <w:t xml:space="preserve"> motion sickness for certain users</w:t>
             </w:r>
             <w:r>
               <w:rPr>
@@ -2558,28 +2691,7 @@
                 <w:color w:val="9933FF"/>
                 <w:lang w:val="en-GB"/>
               </w:rPr>
-              <w:t xml:space="preserve">WC </w:t>
-            </w:r>
-            <w:r>
-              <w:rPr>
-                <w:color w:val="9933FF"/>
-                <w:lang w:val="en-GB"/>
-              </w:rPr>
-              <w:t>24</w:t>
-            </w:r>
-            <w:r>
-              <w:rPr>
-                <w:color w:val="9933FF"/>
-                <w:lang w:val="en-GB"/>
-              </w:rPr>
-              <w:t>/</w:t>
-            </w:r>
-            <w:r>
-              <w:rPr>
-                <w:color w:val="9933FF"/>
-                <w:lang w:val="en-GB"/>
-              </w:rPr>
-              <w:t>2</w:t>
+              <w:t>WC 24/2</w:t>
             </w:r>
           </w:p>
           <w:p>
@@ -2604,7 +2716,19 @@
               <w:rPr>
                 <w:lang w:val="en-GB"/>
               </w:rPr>
-              <w:t>– develop a solution to allow the program to assume the action the player is making. For example, waving, punching or thumbs up.</w:t>
+              <w:t xml:space="preserve">– develop a </w:t>
+            </w:r>
+            <w:r>
+              <w:rPr>
+                <w:lang w:val="en-GB"/>
+              </w:rPr>
+              <w:t>system that recognises</w:t>
+            </w:r>
+            <w:r>
+              <w:rPr>
+                <w:lang w:val="en-GB"/>
+              </w:rPr>
+              <w:t xml:space="preserve"> the action the player is making. For example, waving, punching or thumbs up.</w:t>
             </w:r>
             <w:r>
               <w:rPr>
@@ -2660,7 +2784,13 @@
               <w:rPr>
                 <w:lang w:val="en-GB"/>
               </w:rPr>
-              <w:t xml:space="preserve"> elements. And allow the player the ability to use them</w:t>
+              <w:t xml:space="preserve"> elements </w:t>
+            </w:r>
+            <w:r>
+              <w:rPr>
+                <w:lang w:val="en-GB"/>
+              </w:rPr>
+              <w:t>and</w:t>
             </w:r>
             <w:r>
               <w:rPr>
@@ -2670,75 +2800,34 @@
             </w:r>
             <w:r>
               <w:rPr>
+                <w:lang w:val="en-GB"/>
+              </w:rPr>
+              <w:t>enable the</w:t>
+            </w:r>
+            <w:r>
+              <w:rPr>
+                <w:lang w:val="en-GB"/>
+              </w:rPr>
+              <w:t xml:space="preserve"> player the ability to use them</w:t>
+            </w:r>
+            <w:r>
+              <w:rPr>
+                <w:lang w:val="en-GB"/>
+              </w:rPr>
+              <w:t xml:space="preserve"> with gestures</w:t>
+            </w:r>
+            <w:r>
+              <w:rPr>
+                <w:lang w:val="en-GB"/>
+              </w:rPr>
+              <w:t xml:space="preserve"> </w:t>
+            </w:r>
+            <w:r>
+              <w:rPr>
                 <w:color w:val="9933FF"/>
                 <w:lang w:val="en-GB"/>
               </w:rPr>
               <w:t>WC 10/</w:t>
-            </w:r>
-            <w:r>
-              <w:rPr>
-                <w:color w:val="9933FF"/>
-                <w:lang w:val="en-GB"/>
-              </w:rPr>
-              <w:t>3</w:t>
-            </w:r>
-          </w:p>
-          <w:p>
-            <w:pPr>
-              <w:pStyle w:val="ListParagraph"/>
-              <w:numPr>
-                <w:ilvl w:val="0"/>
-                <w:numId w:val="2"/>
-              </w:numPr>
-              <w:rPr>
-                <w:lang w:val="en-GB"/>
-              </w:rPr>
-            </w:pPr>
-            <w:r>
-              <w:rPr>
-                <w:color w:val="3880DD" w:themeColor="accent1" w:themeTint="99"/>
-                <w:lang w:val="en-GB"/>
-              </w:rPr>
-              <w:t xml:space="preserve">Entities </w:t>
-            </w:r>
-            <w:r>
-              <w:rPr>
-                <w:lang w:val="en-GB"/>
-              </w:rPr>
-              <w:t>– Program a solution to handle logic specific to entities, allowing them to be damage</w:t>
-            </w:r>
-            <w:r>
-              <w:rPr>
-                <w:lang w:val="en-GB"/>
-              </w:rPr>
-              <w:t>d, use abilities or move</w:t>
-            </w:r>
-            <w:r>
-              <w:rPr>
-                <w:lang w:val="en-GB"/>
-              </w:rPr>
-              <w:t xml:space="preserve"> </w:t>
-            </w:r>
-            <w:r>
-              <w:rPr>
-                <w:color w:val="9933FF"/>
-                <w:lang w:val="en-GB"/>
-              </w:rPr>
-              <w:t xml:space="preserve">WC </w:t>
-            </w:r>
-            <w:r>
-              <w:rPr>
-                <w:color w:val="9933FF"/>
-                <w:lang w:val="en-GB"/>
-              </w:rPr>
-              <w:t>24</w:t>
-            </w:r>
-            <w:r>
-              <w:rPr>
-                <w:color w:val="9933FF"/>
-                <w:lang w:val="en-GB"/>
-              </w:rPr>
-              <w:t>/</w:t>
             </w:r>
             <w:r>
               <w:rPr>
@@ -2802,6 +2891,7 @@
                 <w:lang w:val="en-GB"/>
               </w:rPr>
             </w:pPr>
+            <w:bookmarkStart w:id="6" w:name="_Toc189647770"/>
             <w:r>
               <w:rPr>
                 <w:rStyle w:val="Emphasis"/>
@@ -2810,6 +2900,7 @@
               </w:rPr>
               <w:t>Stretch Goals</w:t>
             </w:r>
+            <w:bookmarkEnd w:id="6"/>
           </w:p>
           <w:p>
             <w:pPr>
@@ -2950,23 +3041,7 @@
                 <w:color w:val="000000" w:themeColor="text1"/>
                 <w:lang w:val="en-GB"/>
               </w:rPr>
-              <w:t xml:space="preserve">– Create a scalable system that allows entities including the player to be </w:t>
-            </w:r>
-            <w:proofErr w:type="gramStart"/>
-            <w:r>
-              <w:rPr>
-                <w:color w:val="000000" w:themeColor="text1"/>
-                <w:lang w:val="en-GB"/>
-              </w:rPr>
-              <w:t>effected</w:t>
-            </w:r>
-            <w:proofErr w:type="gramEnd"/>
-            <w:r>
-              <w:rPr>
-                <w:color w:val="000000" w:themeColor="text1"/>
-                <w:lang w:val="en-GB"/>
-              </w:rPr>
-              <w:t xml:space="preserve"> by specific buffs or nerfs pertaining to an ability, for example: </w:t>
+              <w:t xml:space="preserve">– Create a scalable system that allows entities including the player to be effected by specific buffs or nerfs pertaining to an ability, for example: </w:t>
             </w:r>
             <w:r>
               <w:rPr>
@@ -3056,6 +3131,7 @@
                 <w:color w:val="3880DD" w:themeColor="accent1" w:themeTint="99"/>
                 <w:lang w:val="en-GB"/>
               </w:rPr>
+              <w:lastRenderedPageBreak/>
               <w:t xml:space="preserve">Puzzles </w:t>
             </w:r>
             <w:r>
@@ -3068,39 +3144,36 @@
           </w:p>
           <w:p>
             <w:pPr>
-              <w:pStyle w:val="Text"/>
-              <w:rPr>
-                <w:noProof/>
-                <w:lang w:val="en-GB"/>
-              </w:rPr>
-            </w:pPr>
-          </w:p>
-          <w:p>
-            <w:pPr>
-              <w:pStyle w:val="Text"/>
-              <w:rPr>
-                <w:noProof/>
-                <w:lang w:val="en-GB"/>
-              </w:rPr>
-            </w:pPr>
-          </w:p>
-          <w:p>
-            <w:pPr>
-              <w:pStyle w:val="Text"/>
-              <w:rPr>
-                <w:noProof/>
-                <w:lang w:val="en-GB"/>
-              </w:rPr>
-            </w:pPr>
-          </w:p>
-          <w:p>
-            <w:pPr>
-              <w:pStyle w:val="Text"/>
-              <w:rPr>
-                <w:noProof/>
-                <w:lang w:val="en-GB"/>
-              </w:rPr>
-            </w:pPr>
+              <w:pStyle w:val="ListParagraph"/>
+              <w:numPr>
+                <w:ilvl w:val="0"/>
+                <w:numId w:val="3"/>
+              </w:numPr>
+              <w:rPr>
+                <w:color w:val="000000" w:themeColor="text1"/>
+                <w:lang w:val="en-GB"/>
+              </w:rPr>
+            </w:pPr>
+            <w:r>
+              <w:rPr>
+                <w:color w:val="3880DD" w:themeColor="accent1" w:themeTint="99"/>
+                <w:lang w:val="en-GB"/>
+              </w:rPr>
+              <w:t xml:space="preserve">Entities </w:t>
+            </w:r>
+            <w:r>
+              <w:rPr>
+                <w:lang w:val="en-GB"/>
+              </w:rPr>
+              <w:t xml:space="preserve">– Program a solution to handle logic specific to entities, allowing them to be damaged, use abilities or move </w:t>
+            </w:r>
+            <w:r>
+              <w:rPr>
+                <w:color w:val="9933FF"/>
+                <w:lang w:val="en-GB"/>
+              </w:rPr>
+              <w:t>WC 24/3</w:t>
+            </w:r>
           </w:p>
         </w:tc>
         <w:tc>
@@ -3127,7 +3200,7 @@
           <w:lang w:val="en-GB"/>
         </w:rPr>
       </w:pPr>
-      <w:bookmarkStart w:id="4" w:name="_Toc189602845"/>
+      <w:bookmarkStart w:id="7" w:name="_Toc189647771"/>
       <w:r>
         <w:rPr>
           <w:noProof/>
@@ -3138,7 +3211,7 @@
         <mc:AlternateContent>
           <mc:Choice Requires="wps">
             <w:drawing>
-              <wp:anchor distT="0" distB="0" distL="114300" distR="114300" simplePos="0" relativeHeight="251661312" behindDoc="1" locked="0" layoutInCell="1" allowOverlap="1" wp14:anchorId="7B521393" wp14:editId="16C5EC36">
+              <wp:anchor distT="0" distB="0" distL="114300" distR="114300" simplePos="0" relativeHeight="251661312" behindDoc="1" locked="0" layoutInCell="1" allowOverlap="1" wp14:anchorId="7B521393" wp14:editId="2635772F">
                 <wp:simplePos x="0" y="0"/>
                 <wp:positionH relativeFrom="column">
                   <wp:posOffset>-430964</wp:posOffset>
@@ -3225,7 +3298,7 @@
           </mc:Choice>
           <mc:Fallback>
             <w:pict>
-              <v:shape w14:anchorId="55A49782" id="Shape" o:spid="_x0000_s1026" alt="&quot;&quot;" style="position:absolute;margin-left:-33.95pt;margin-top:-749.8pt;width:611.9pt;height:753.7pt;z-index:-251655168;visibility:visible;mso-wrap-style:square;mso-height-percent:0;mso-wrap-distance-left:9pt;mso-wrap-distance-top:0;mso-wrap-distance-right:9pt;mso-wrap-distance-bottom:0;mso-position-horizontal:absolute;mso-position-horizontal-relative:text;mso-position-vertical:absolute;mso-position-vertical-relative:text;mso-height-percent:0;mso-height-relative:margin;v-text-anchor:middle" coordsize="21600,21600" o:gfxdata="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" path="m,14678r,6922l21600,3032,21600,,17075,,,14678xe" fillcolor="#123869 [3204]" stroked="f" strokeweight="1pt">
+              <v:shape w14:anchorId="019DE0DD" id="Shape" o:spid="_x0000_s1026" alt="&quot;&quot;" style="position:absolute;margin-left:-33.95pt;margin-top:-749.8pt;width:611.9pt;height:753.7pt;z-index:-251655168;visibility:visible;mso-wrap-style:square;mso-height-percent:0;mso-wrap-distance-left:9pt;mso-wrap-distance-top:0;mso-wrap-distance-right:9pt;mso-wrap-distance-bottom:0;mso-position-horizontal:absolute;mso-position-horizontal-relative:text;mso-position-vertical:absolute;mso-position-vertical-relative:text;mso-height-percent:0;mso-height-relative:margin;v-text-anchor:middle" coordsize="21600,21600" o:gfxdata="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" path="m,14678r,6922l21600,3032,21600,,17075,,,14678xe" fillcolor="#123869 [3204]" stroked="f" strokeweight="1pt">
                 <v:stroke miterlimit="4" joinstyle="miter"/>
                 <v:path arrowok="t" o:extrusionok="f" o:connecttype="custom" o:connectlocs="3885565,4786148;3885565,4786148;3885565,4786148;3885565,4786148" o:connectangles="0,90,180,270"/>
               </v:shape>
@@ -3233,8 +3306,38 @@
           </mc:Fallback>
         </mc:AlternateContent>
       </w:r>
-      <w:bookmarkStart w:id="5" w:name="_Toc189602847"/>
-      <w:bookmarkEnd w:id="4"/>
+      <w:bookmarkEnd w:id="7"/>
+    </w:p>
+    <w:p>
+      <w:pPr>
+        <w:rPr>
+          <w:lang w:val="en-GB"/>
+        </w:rPr>
+      </w:pPr>
+    </w:p>
+    <w:p>
+      <w:pPr>
+        <w:rPr>
+          <w:lang w:val="en-GB"/>
+        </w:rPr>
+      </w:pPr>
+    </w:p>
+    <w:p>
+      <w:pPr>
+        <w:rPr>
+          <w:lang w:val="en-GB"/>
+        </w:rPr>
+      </w:pPr>
+    </w:p>
+    <w:p>
+      <w:pPr>
+        <w:pStyle w:val="Heading1"/>
+        <w:rPr>
+          <w:sz w:val="32"/>
+          <w:lang w:val="en-GB"/>
+        </w:rPr>
+      </w:pPr>
+      <w:bookmarkStart w:id="8" w:name="_Toc189647772"/>
       <w:r>
         <w:rPr>
           <w:sz w:val="72"/>
@@ -3258,6 +3361,7 @@
         </w:rPr>
         <w:t>Scope</w:t>
       </w:r>
+      <w:bookmarkEnd w:id="8"/>
     </w:p>
     <w:p>
       <w:pPr>
@@ -3272,6 +3376,18 @@
           <w:lang w:val="en-GB"/>
         </w:rPr>
       </w:pPr>
+      <w:r>
+        <w:rPr>
+          <w:lang w:val="en-GB"/>
+        </w:rPr>
+        <w:t>For my product I plan to make a simple demo of a game where you the player play as a conductor of elements; the player can use their arms, head and a combination of buttons to activate various abilities. Said system should give an increased number of possible inputs to allow the player access to more abilities all at once, all the while making them intuitive and easy to use</w:t>
+      </w:r>
+      <w:r>
+        <w:rPr>
+          <w:lang w:val="en-GB"/>
+        </w:rPr>
+        <w:t xml:space="preserve">. </w:t>
+      </w:r>
     </w:p>
     <w:p>
       <w:pPr>
@@ -3286,6 +3402,12 @@
           <w:lang w:val="en-GB"/>
         </w:rPr>
       </w:pPr>
+      <w:r>
+        <w:rPr>
+          <w:lang w:val="en-GB"/>
+        </w:rPr>
+        <w:t>All moves will be gesture activated, using a series of in person moves and poses in order to activate specific abilities. The main brunt of the work will be in developing a solution that allows the player to freely do any move and have it checked against a library of other moves</w:t>
+      </w:r>
     </w:p>
     <w:p>
       <w:pPr>
@@ -3294,7 +3416,6 @@
         </w:rPr>
       </w:pPr>
     </w:p>
-    <w:p/>
     <w:p>
       <w:pPr>
         <w:rPr>
@@ -3325,19 +3446,13 @@
     </w:p>
     <w:p>
       <w:pPr>
-        <w:rPr>
-          <w:lang w:val="en-GB"/>
-        </w:rPr>
-      </w:pPr>
-    </w:p>
-    <w:p>
-      <w:pPr>
         <w:pStyle w:val="Heading1"/>
         <w:rPr>
           <w:noProof/>
           <w:lang w:val="en-GB"/>
         </w:rPr>
       </w:pPr>
+      <w:bookmarkStart w:id="9" w:name="_Toc189647773"/>
       <w:r>
         <w:rPr>
           <w:noProof/>
@@ -3345,7 +3460,7 @@
         </w:rPr>
         <w:t>Referencing</w:t>
       </w:r>
-      <w:bookmarkEnd w:id="5"/>
+      <w:bookmarkEnd w:id="9"/>
     </w:p>
     <w:sectPr>
       <w:footerReference w:type="even" r:id="rId11"/>
@@ -3362,7 +3477,7 @@
 </file>
 
 <file path=word/endnotes.xml><?xml version="1.0" encoding="utf-8"?>
-<w:endnotes xmlns:wpc="http://schemas.microsoft.com/office/word/2010/wordprocessingCanvas" xmlns:cx="http://schemas.microsoft.com/office/drawing/2014/chartex" xmlns:cx1="http://schemas.microsoft.com/office/drawing/2015/9/8/chartex" xmlns:cx2="http://schemas.microsoft.com/office/drawing/2015/10/21/chartex" xmlns:cx3="http://schemas.microsoft.com/office/drawing/2016/5/9/chartex" xmlns:cx4="http://schemas.microsoft.com/office/drawing/2016/5/10/chartex" xmlns:cx5="http://schemas.microsoft.com/office/drawing/2016/5/11/chartex" xmlns:cx6="http://schemas.microsoft.com/office/drawing/2016/5/12/chartex" xmlns:cx7="http://schemas.microsoft.com/office/drawing/2016/5/13/chartex" xmlns:cx8="http://schemas.microsoft.com/office/drawing/2016/5/14/chartex" xmlns:mc="http://schemas.openxmlformats.org/markup-compatibility/2006" xmlns:aink="http://schemas.microsoft.com/office/drawing/2016/ink" xmlns:am3d="http://schemas.microsoft.com/office/drawing/2017/model3d" xmlns:o="urn:schemas-microsoft-com:office:office" xmlns:oel="http://schemas.microsoft.com/office/2019/extlst" xmlns:r="http://schemas.openxmlformats.org/officeDocument/2006/relationships" xmlns:m="http://schemas.openxmlformats.org/officeDocument/2006/math" xmlns:v="urn:schemas-microsoft-com:vml" xmlns:wp14="http://schemas.microsoft.com/office/word/2010/wordprocessingDrawing" xmlns:wp="http://schemas.openxmlformats.org/drawingml/2006/wordprocessingDrawing" xmlns:w10="urn:schemas-microsoft-com:office:word" xmlns:w="http://schemas.openxmlformats.org/wordprocessingml/2006/main" xmlns:w14="http://schemas.microsoft.com/office/word/2010/wordml" xmlns:w15="http://schemas.microsoft.com/office/word/2012/wordml" xmlns:w16cex="http://schemas.microsoft.com/office/word/2018/wordml/cex" xmlns:w16cid="http://schemas.microsoft.com/office/word/2016/wordml/cid" xmlns:w16="http://schemas.microsoft.com/office/word/2018/wordml" xmlns:w16du="http://schemas.microsoft.com/office/word/2023/wordml/word16du" xmlns:w16sdtdh="http://schemas.microsoft.com/office/word/2020/wordml/sdtdatahash" xmlns:w16se="http://schemas.microsoft.com/office/word/2015/wordml/symex" xmlns:wpg="http://schemas.microsoft.com/office/word/2010/wordprocessingGroup" xmlns:wpi="http://schemas.microsoft.com/office/word/2010/wordprocessingInk" xmlns:wne="http://schemas.microsoft.com/office/word/2006/wordml" xmlns:wps="http://schemas.microsoft.com/office/word/2010/wordprocessingShape" mc:Ignorable="w14 w15 w16se w16cid w16 w16cex w16sdtdh w16du wp14">
+<w:endnotes xmlns:wpc="http://schemas.microsoft.com/office/word/2010/wordprocessingCanvas" xmlns:cx="http://schemas.microsoft.com/office/drawing/2014/chartex" xmlns:cx1="http://schemas.microsoft.com/office/drawing/2015/9/8/chartex" xmlns:cx2="http://schemas.microsoft.com/office/drawing/2015/10/21/chartex" xmlns:cx3="http://schemas.microsoft.com/office/drawing/2016/5/9/chartex" xmlns:cx4="http://schemas.microsoft.com/office/drawing/2016/5/10/chartex" xmlns:cx5="http://schemas.microsoft.com/office/drawing/2016/5/11/chartex" xmlns:cx6="http://schemas.microsoft.com/office/drawing/2016/5/12/chartex" xmlns:cx7="http://schemas.microsoft.com/office/drawing/2016/5/13/chartex" xmlns:cx8="http://schemas.microsoft.com/office/drawing/2016/5/14/chartex" xmlns:mc="http://schemas.openxmlformats.org/markup-compatibility/2006" xmlns:aink="http://schemas.microsoft.com/office/drawing/2016/ink" xmlns:am3d="http://schemas.microsoft.com/office/drawing/2017/model3d" xmlns:o="urn:schemas-microsoft-com:office:office" xmlns:oel="http://schemas.microsoft.com/office/2019/extlst" xmlns:r="http://schemas.openxmlformats.org/officeDocument/2006/relationships" xmlns:m="http://schemas.openxmlformats.org/officeDocument/2006/math" xmlns:v="urn:schemas-microsoft-com:vml" xmlns:wp14="http://schemas.microsoft.com/office/word/2010/wordprocessingDrawing" xmlns:wp="http://schemas.openxmlformats.org/drawingml/2006/wordprocessingDrawing" xmlns:w10="urn:schemas-microsoft-com:office:word" xmlns:w="http://schemas.openxmlformats.org/wordprocessingml/2006/main" xmlns:w14="http://schemas.microsoft.com/office/word/2010/wordml" xmlns:w15="http://schemas.microsoft.com/office/word/2012/wordml" xmlns:w16cex="http://schemas.microsoft.com/office/word/2018/wordml/cex" xmlns:w16cid="http://schemas.microsoft.com/office/word/2016/wordml/cid" xmlns:w16="http://schemas.microsoft.com/office/word/2018/wordml" xmlns:w16du="http://schemas.microsoft.com/office/word/2023/wordml/word16du" xmlns:w16sdtdh="http://schemas.microsoft.com/office/word/2020/wordml/sdtdatahash" xmlns:w16sdtfl="http://schemas.microsoft.com/office/word/2024/wordml/sdtformatlock" xmlns:w16se="http://schemas.microsoft.com/office/word/2015/wordml/symex" xmlns:wpg="http://schemas.microsoft.com/office/word/2010/wordprocessingGroup" xmlns:wpi="http://schemas.microsoft.com/office/word/2010/wordprocessingInk" xmlns:wne="http://schemas.microsoft.com/office/word/2006/wordml" xmlns:wps="http://schemas.microsoft.com/office/word/2010/wordprocessingShape" mc:Ignorable="w14 w15 w16se w16cid w16 w16cex w16sdtdh w16sdtfl w16du wp14">
   <w:endnote w:type="separator" w:id="-1">
     <w:p>
       <w:r>
@@ -3510,14 +3625,30 @@
           <w:sz w:val="22"/>
           <w:szCs w:val="22"/>
         </w:rPr>
-        <w:t xml:space="preserve"> </w:t>
+        <w:t xml:space="preserve"> The Dragon Prince</w:t>
       </w:r>
       <w:r>
         <w:rPr>
           <w:sz w:val="22"/>
           <w:szCs w:val="22"/>
         </w:rPr>
-        <w:t>The Dragon Prince</w:t>
+        <w:t xml:space="preserve"> [television </w:t>
+      </w:r>
+      <w:proofErr w:type="spellStart"/>
+      <w:r>
+        <w:rPr>
+          <w:sz w:val="22"/>
+          <w:szCs w:val="22"/>
+        </w:rPr>
+        <w:t>programme</w:t>
+      </w:r>
+      <w:proofErr w:type="spellEnd"/>
+      <w:r>
+        <w:rPr>
+          <w:sz w:val="22"/>
+          <w:szCs w:val="22"/>
+        </w:rPr>
+        <w:t>], Bardel Entertainment, United States Canada, [2018]</w:t>
       </w:r>
     </w:p>
     <w:p>
@@ -3526,6 +3657,510 @@
         <w:rPr>
           <w:sz w:val="22"/>
           <w:szCs w:val="22"/>
+          <w:lang w:val="en-GB"/>
+        </w:rPr>
+      </w:pPr>
+    </w:p>
+    <w:p>
+      <w:pPr>
+        <w:pStyle w:val="EndnoteText"/>
+        <w:rPr>
+          <w:sz w:val="22"/>
+          <w:szCs w:val="22"/>
+          <w:lang w:val="en-GB"/>
+        </w:rPr>
+      </w:pPr>
+    </w:p>
+    <w:p>
+      <w:pPr>
+        <w:pStyle w:val="EndnoteText"/>
+        <w:rPr>
+          <w:sz w:val="22"/>
+          <w:szCs w:val="22"/>
+          <w:lang w:val="en-GB"/>
+        </w:rPr>
+      </w:pPr>
+    </w:p>
+    <w:p>
+      <w:pPr>
+        <w:pStyle w:val="EndnoteText"/>
+        <w:rPr>
+          <w:sz w:val="22"/>
+          <w:szCs w:val="22"/>
+          <w:lang w:val="en-GB"/>
+        </w:rPr>
+      </w:pPr>
+    </w:p>
+    <w:p>
+      <w:pPr>
+        <w:pStyle w:val="EndnoteText"/>
+        <w:rPr>
+          <w:sz w:val="22"/>
+          <w:szCs w:val="22"/>
+          <w:lang w:val="en-GB"/>
+        </w:rPr>
+      </w:pPr>
+    </w:p>
+    <w:p>
+      <w:pPr>
+        <w:pStyle w:val="EndnoteText"/>
+        <w:rPr>
+          <w:sz w:val="22"/>
+          <w:szCs w:val="22"/>
+          <w:lang w:val="en-GB"/>
+        </w:rPr>
+      </w:pPr>
+    </w:p>
+    <w:p>
+      <w:pPr>
+        <w:pStyle w:val="EndnoteText"/>
+        <w:rPr>
+          <w:sz w:val="22"/>
+          <w:szCs w:val="22"/>
+          <w:lang w:val="en-GB"/>
+        </w:rPr>
+      </w:pPr>
+    </w:p>
+    <w:p>
+      <w:pPr>
+        <w:pStyle w:val="EndnoteText"/>
+        <w:rPr>
+          <w:sz w:val="22"/>
+          <w:szCs w:val="22"/>
+          <w:lang w:val="en-GB"/>
+        </w:rPr>
+      </w:pPr>
+    </w:p>
+    <w:p>
+      <w:pPr>
+        <w:pStyle w:val="EndnoteText"/>
+        <w:rPr>
+          <w:sz w:val="22"/>
+          <w:szCs w:val="22"/>
+          <w:lang w:val="en-GB"/>
+        </w:rPr>
+      </w:pPr>
+    </w:p>
+    <w:p>
+      <w:pPr>
+        <w:pStyle w:val="Heading1"/>
+        <w:rPr>
+          <w:lang w:val="en-GB"/>
+        </w:rPr>
+      </w:pPr>
+      <w:r>
+        <w:rPr>
+          <w:lang w:val="en-GB"/>
+        </w:rPr>
+        <w:t>Appendix</w:t>
+      </w:r>
+    </w:p>
+    <w:p>
+      <w:pPr>
+        <w:pStyle w:val="ListParagraph"/>
+        <w:numPr>
+          <w:ilvl w:val="0"/>
+          <w:numId w:val="5"/>
+        </w:numPr>
+        <w:rPr>
+          <w:lang w:val="en-GB"/>
+        </w:rPr>
+      </w:pPr>
+      <w:r>
+        <w:rPr>
+          <w:lang w:val="en-GB"/>
+        </w:rPr>
+        <w:t>Example of Gesturing to activate an ability</w:t>
+      </w:r>
+    </w:p>
+    <w:p>
+      <w:pPr>
+        <w:rPr>
+          <w:lang w:val="en-GB"/>
+        </w:rPr>
+      </w:pPr>
+      <w:r>
+        <w:rPr>
+          <w:noProof/>
+        </w:rPr>
+        <w:drawing>
+          <wp:inline distT="0" distB="0" distL="0" distR="0" wp14:anchorId="641CD911" wp14:editId="6C5C168E">
+            <wp:extent cx="5409398" cy="3045261"/>
+            <wp:effectExtent l="0" t="0" r="1270" b="3175"/>
+            <wp:docPr id="67358073" name="Picture 1"/>
+            <wp:cNvGraphicFramePr>
+              <a:graphicFrameLocks xmlns:a="http://schemas.openxmlformats.org/drawingml/2006/main" noChangeAspect="1"/>
+            </wp:cNvGraphicFramePr>
+            <a:graphic xmlns:a="http://schemas.openxmlformats.org/drawingml/2006/main">
+              <a:graphicData uri="http://schemas.openxmlformats.org/drawingml/2006/picture">
+                <pic:pic xmlns:pic="http://schemas.openxmlformats.org/drawingml/2006/picture">
+                  <pic:nvPicPr>
+                    <pic:cNvPr id="0" name="Picture 1"/>
+                    <pic:cNvPicPr>
+                      <a:picLocks noChangeAspect="1" noChangeArrowheads="1"/>
+                    </pic:cNvPicPr>
+                  </pic:nvPicPr>
+                  <pic:blipFill>
+                    <a:blip r:embed="rId1">
+                      <a:extLst>
+                        <a:ext uri="{28A0092B-C50C-407E-A947-70E740481C1C}">
+                          <a14:useLocalDpi xmlns:a14="http://schemas.microsoft.com/office/drawing/2010/main" val="0"/>
+                        </a:ext>
+                      </a:extLst>
+                    </a:blip>
+                    <a:srcRect/>
+                    <a:stretch>
+                      <a:fillRect/>
+                    </a:stretch>
+                  </pic:blipFill>
+                  <pic:spPr bwMode="auto">
+                    <a:xfrm>
+                      <a:off x="0" y="0"/>
+                      <a:ext cx="5414628" cy="3048205"/>
+                    </a:xfrm>
+                    <a:prstGeom prst="rect">
+                      <a:avLst/>
+                    </a:prstGeom>
+                    <a:noFill/>
+                    <a:ln>
+                      <a:noFill/>
+                    </a:ln>
+                  </pic:spPr>
+                </pic:pic>
+              </a:graphicData>
+            </a:graphic>
+          </wp:inline>
+        </w:drawing>
+      </w:r>
+    </w:p>
+    <w:p>
+      <w:pPr>
+        <w:rPr>
+          <w:lang w:val="en-GB"/>
+        </w:rPr>
+      </w:pPr>
+    </w:p>
+    <w:p>
+      <w:pPr>
+        <w:rPr>
+          <w:lang w:val="en-GB"/>
+        </w:rPr>
+      </w:pPr>
+    </w:p>
+    <w:p>
+      <w:pPr>
+        <w:rPr>
+          <w:lang w:val="en-GB"/>
+        </w:rPr>
+      </w:pPr>
+      <w:r>
+        <w:rPr>
+          <w:lang w:val="en-GB"/>
+        </w:rPr>
+        <w:t>Game Design Document</w:t>
+      </w:r>
+    </w:p>
+    <w:p>
+      <w:pPr>
+        <w:rPr>
+          <w:lang w:val="en-GB"/>
+        </w:rPr>
+      </w:pPr>
+      <w:r>
+        <w:rPr>
+          <w:lang w:val="en-GB"/>
+        </w:rPr>
+        <w:t xml:space="preserve">I will be attempting to bind the user’s possible progression to the aforementioned chakra’s using abilities from each of the standard 7 which also links them closely to a part of the body, and an element of nature. With this as the basis for how different abilities are </w:t>
+      </w:r>
+      <w:proofErr w:type="gramStart"/>
+      <w:r>
+        <w:rPr>
+          <w:lang w:val="en-GB"/>
+        </w:rPr>
+        <w:t>unlocked</w:t>
+      </w:r>
+      <w:proofErr w:type="gramEnd"/>
+      <w:r>
+        <w:rPr>
+          <w:lang w:val="en-GB"/>
+        </w:rPr>
+        <w:t xml:space="preserve"> I would similarly like to use these for the theming of the game. </w:t>
+      </w:r>
+      <w:proofErr w:type="gramStart"/>
+      <w:r>
+        <w:rPr>
+          <w:lang w:val="en-GB"/>
+        </w:rPr>
+        <w:t>Overall</w:t>
+      </w:r>
+      <w:proofErr w:type="gramEnd"/>
+      <w:r>
+        <w:rPr>
+          <w:lang w:val="en-GB"/>
+        </w:rPr>
+        <w:t xml:space="preserve"> I plan to divide the 7 chakras into two groups. Abstract Elements and Tangible Elements. Abstract elements will be used more subtly, for the likes of UI elements and menus; Tangible Elements will be more gameplay specific </w:t>
+      </w:r>
+    </w:p>
+    <w:p>
+      <w:pPr>
+        <w:rPr>
+          <w:lang w:val="en-GB"/>
+        </w:rPr>
+      </w:pPr>
+    </w:p>
+    <w:p>
+      <w:pPr>
+        <w:pStyle w:val="Heading2"/>
+        <w:rPr>
+          <w:lang w:val="en-GB"/>
+        </w:rPr>
+      </w:pPr>
+      <w:r>
+        <w:rPr>
+          <w:lang w:val="en-GB"/>
+        </w:rPr>
+        <w:t>Abstract Elements</w:t>
+      </w:r>
+    </w:p>
+    <w:p>
+      <w:pPr>
+        <w:rPr>
+          <w:lang w:val="en-GB"/>
+        </w:rPr>
+      </w:pPr>
+      <w:r>
+        <w:rPr>
+          <w:lang w:val="en-GB"/>
+        </w:rPr>
+        <w:t>In regards, to the utilization of abstract elements, they, as mentioned, will be used a passive thematic layer for certain aspects of the game. An example of this would be utilising OM for pause menus and light; making the surroundings darken and bringing up menus in front of the player.</w:t>
+      </w:r>
+    </w:p>
+    <w:p>
+      <w:pPr>
+        <w:rPr>
+          <w:lang w:val="en-GB"/>
+        </w:rPr>
+      </w:pPr>
+      <w:r>
+        <w:rPr>
+          <w:lang w:val="en-GB"/>
+        </w:rPr>
+        <w:t>I would like it to be done in such a way that it doesn’t remove the player from the action, and keeping them immersed up until they decide to take off the headset.</w:t>
+      </w:r>
+    </w:p>
+    <w:p>
+      <w:pPr>
+        <w:rPr>
+          <w:lang w:val="en-GB"/>
+        </w:rPr>
+      </w:pPr>
+    </w:p>
+    <w:p>
+      <w:pPr>
+        <w:rPr>
+          <w:lang w:val="en-GB"/>
+        </w:rPr>
+      </w:pPr>
+      <w:r>
+        <w:rPr>
+          <w:lang w:val="en-GB"/>
+        </w:rPr>
+        <w:t>As such my UI designs will be simple at first, but I hope to properly design them in a way that best makes use of UI’s physical advantages. For example, making sliders grabbable objects and menus physical walls.</w:t>
+      </w:r>
+    </w:p>
+    <w:p>
+      <w:pPr>
+        <w:rPr>
+          <w:lang w:val="en-GB"/>
+        </w:rPr>
+      </w:pPr>
+    </w:p>
+    <w:p>
+      <w:pPr>
+        <w:rPr>
+          <w:lang w:val="en-GB"/>
+        </w:rPr>
+      </w:pPr>
+    </w:p>
+    <w:p>
+      <w:pPr>
+        <w:rPr>
+          <w:lang w:val="en-GB"/>
+        </w:rPr>
+      </w:pPr>
+      <w:r>
+        <w:rPr>
+          <w:lang w:val="en-GB"/>
+        </w:rPr>
+        <w:t>[Insert Examples of UI Wireframes here]</w:t>
+      </w:r>
+    </w:p>
+    <w:p/>
+    <w:p>
+      <w:pPr>
+        <w:pStyle w:val="Heading2"/>
+        <w:rPr>
+          <w:lang w:val="en-GB"/>
+        </w:rPr>
+      </w:pPr>
+      <w:r>
+        <w:rPr>
+          <w:lang w:val="en-GB"/>
+        </w:rPr>
+        <w:t>Tangible Elements</w:t>
+      </w:r>
+    </w:p>
+    <w:p>
+      <w:pPr>
+        <w:rPr>
+          <w:lang w:val="en-GB"/>
+        </w:rPr>
+      </w:pPr>
+      <w:r>
+        <w:rPr>
+          <w:lang w:val="en-GB"/>
+        </w:rPr>
+        <w:t xml:space="preserve">The more fun of the two, Tangible elements are the abilities that player can use to interact with the world.  Whether by using wind to blow a sail, fire to burn a barricade or earth to get over a wall. </w:t>
+      </w:r>
+    </w:p>
+    <w:p>
+      <w:pPr>
+        <w:rPr>
+          <w:lang w:val="en-GB"/>
+        </w:rPr>
+      </w:pPr>
+      <w:r>
+        <w:rPr>
+          <w:lang w:val="en-GB"/>
+        </w:rPr>
+        <w:t>In order to make use of an ability, the player will need to</w:t>
+      </w:r>
+    </w:p>
+    <w:p>
+      <w:pPr>
+        <w:pStyle w:val="ListParagraph"/>
+        <w:numPr>
+          <w:ilvl w:val="0"/>
+          <w:numId w:val="4"/>
+        </w:numPr>
+        <w:rPr>
+          <w:lang w:val="en-GB"/>
+        </w:rPr>
+      </w:pPr>
+      <w:r>
+        <w:rPr>
+          <w:lang w:val="en-GB"/>
+        </w:rPr>
+        <w:t>Have the element profile unlocked</w:t>
+      </w:r>
+    </w:p>
+    <w:p>
+      <w:pPr>
+        <w:pStyle w:val="ListParagraph"/>
+        <w:numPr>
+          <w:ilvl w:val="0"/>
+          <w:numId w:val="4"/>
+        </w:numPr>
+        <w:rPr>
+          <w:lang w:val="en-GB"/>
+        </w:rPr>
+      </w:pPr>
+      <w:r>
+        <w:rPr>
+          <w:lang w:val="en-GB"/>
+        </w:rPr>
+        <w:t>Have the ability unlocked</w:t>
+      </w:r>
+    </w:p>
+    <w:p>
+      <w:pPr>
+        <w:pStyle w:val="ListParagraph"/>
+        <w:numPr>
+          <w:ilvl w:val="0"/>
+          <w:numId w:val="4"/>
+        </w:numPr>
+        <w:rPr>
+          <w:lang w:val="en-GB"/>
+        </w:rPr>
+      </w:pPr>
+      <w:r>
+        <w:rPr>
+          <w:lang w:val="en-GB"/>
+        </w:rPr>
+        <w:t>Know the gesture for said ability</w:t>
+      </w:r>
+    </w:p>
+    <w:p>
+      <w:pPr>
+        <w:rPr>
+          <w:lang w:val="en-GB"/>
+        </w:rPr>
+      </w:pPr>
+      <w:r>
+        <w:rPr>
+          <w:lang w:val="en-GB"/>
+        </w:rPr>
+        <w:t xml:space="preserve">Once these checks are all true the player can use an ability by first selecting a stance, a set of pre-determined positions in local space that the controllers can be, then performing a gesture or combination of gestures. Each ability will have an attributed combination of gestures that will be checked against a </w:t>
+      </w:r>
+      <w:proofErr w:type="spellStart"/>
+      <w:r>
+        <w:rPr>
+          <w:lang w:val="en-GB"/>
+        </w:rPr>
+        <w:t>GestureRecogniser</w:t>
+      </w:r>
+      <w:proofErr w:type="spellEnd"/>
+      <w:r>
+        <w:rPr>
+          <w:lang w:val="en-GB"/>
+        </w:rPr>
+        <w:t xml:space="preserve"> which will broadcast an event when a gesture is made. </w:t>
+      </w:r>
+    </w:p>
+    <w:p>
+      <w:pPr>
+        <w:rPr>
+          <w:lang w:val="en-GB"/>
+        </w:rPr>
+      </w:pPr>
+    </w:p>
+    <w:p>
+      <w:pPr>
+        <w:rPr>
+          <w:lang w:val="en-GB"/>
+        </w:rPr>
+      </w:pPr>
+      <w:r>
+        <w:rPr>
+          <w:lang w:val="en-GB"/>
+        </w:rPr>
+        <w:t>When a set of gestures are performed in order, an ability corresponding to this will be activated.</w:t>
+      </w:r>
+    </w:p>
+    <w:p>
+      <w:pPr>
+        <w:rPr>
+          <w:lang w:val="en-GB"/>
+        </w:rPr>
+      </w:pPr>
+    </w:p>
+    <w:p>
+      <w:pPr>
+        <w:pStyle w:val="ListParagraph"/>
+        <w:rPr>
+          <w:lang w:val="en-GB"/>
+        </w:rPr>
+      </w:pPr>
+      <w:r>
+        <w:rPr>
+          <w:lang w:val="en-GB"/>
+        </w:rPr>
+        <w:t>[ See Appendix A: Example of Gesturing to activate an ability]</w:t>
+      </w:r>
+    </w:p>
+    <w:p>
+      <w:pPr>
+        <w:rPr>
           <w:lang w:val="en-GB"/>
         </w:rPr>
       </w:pPr>
@@ -3535,7 +4170,7 @@
 </file>
 
 <file path=word/footer1.xml><?xml version="1.0" encoding="utf-8"?>
-<w:ftr xmlns:wpc="http://schemas.microsoft.com/office/word/2010/wordprocessingCanvas" xmlns:cx="http://schemas.microsoft.com/office/drawing/2014/chartex" xmlns:cx1="http://schemas.microsoft.com/office/drawing/2015/9/8/chartex" xmlns:cx2="http://schemas.microsoft.com/office/drawing/2015/10/21/chartex" xmlns:cx3="http://schemas.microsoft.com/office/drawing/2016/5/9/chartex" xmlns:cx4="http://schemas.microsoft.com/office/drawing/2016/5/10/chartex" xmlns:cx5="http://schemas.microsoft.com/office/drawing/2016/5/11/chartex" xmlns:cx6="http://schemas.microsoft.com/office/drawing/2016/5/12/chartex" xmlns:cx7="http://schemas.microsoft.com/office/drawing/2016/5/13/chartex" xmlns:cx8="http://schemas.microsoft.com/office/drawing/2016/5/14/chartex" xmlns:mc="http://schemas.openxmlformats.org/markup-compatibility/2006" xmlns:aink="http://schemas.microsoft.com/office/drawing/2016/ink" xmlns:am3d="http://schemas.microsoft.com/office/drawing/2017/model3d" xmlns:o="urn:schemas-microsoft-com:office:office" xmlns:oel="http://schemas.microsoft.com/office/2019/extlst" xmlns:r="http://schemas.openxmlformats.org/officeDocument/2006/relationships" xmlns:m="http://schemas.openxmlformats.org/officeDocument/2006/math" xmlns:v="urn:schemas-microsoft-com:vml" xmlns:wp14="http://schemas.microsoft.com/office/word/2010/wordprocessingDrawing" xmlns:wp="http://schemas.openxmlformats.org/drawingml/2006/wordprocessingDrawing" xmlns:w10="urn:schemas-microsoft-com:office:word" xmlns:w="http://schemas.openxmlformats.org/wordprocessingml/2006/main" xmlns:w14="http://schemas.microsoft.com/office/word/2010/wordml" xmlns:w15="http://schemas.microsoft.com/office/word/2012/wordml" xmlns:w16cex="http://schemas.microsoft.com/office/word/2018/wordml/cex" xmlns:w16cid="http://schemas.microsoft.com/office/word/2016/wordml/cid" xmlns:w16="http://schemas.microsoft.com/office/word/2018/wordml" xmlns:w16du="http://schemas.microsoft.com/office/word/2023/wordml/word16du" xmlns:w16sdtdh="http://schemas.microsoft.com/office/word/2020/wordml/sdtdatahash" xmlns:w16se="http://schemas.microsoft.com/office/word/2015/wordml/symex" xmlns:wpg="http://schemas.microsoft.com/office/word/2010/wordprocessingGroup" xmlns:wpi="http://schemas.microsoft.com/office/word/2010/wordprocessingInk" xmlns:wne="http://schemas.microsoft.com/office/word/2006/wordml" xmlns:wps="http://schemas.microsoft.com/office/word/2010/wordprocessingShape" mc:Ignorable="w14 w15 w16se w16cid w16 w16cex w16sdtdh w16du wp14">
+<w:ftr xmlns:wpc="http://schemas.microsoft.com/office/word/2010/wordprocessingCanvas" xmlns:cx="http://schemas.microsoft.com/office/drawing/2014/chartex" xmlns:cx1="http://schemas.microsoft.com/office/drawing/2015/9/8/chartex" xmlns:cx2="http://schemas.microsoft.com/office/drawing/2015/10/21/chartex" xmlns:cx3="http://schemas.microsoft.com/office/drawing/2016/5/9/chartex" xmlns:cx4="http://schemas.microsoft.com/office/drawing/2016/5/10/chartex" xmlns:cx5="http://schemas.microsoft.com/office/drawing/2016/5/11/chartex" xmlns:cx6="http://schemas.microsoft.com/office/drawing/2016/5/12/chartex" xmlns:cx7="http://schemas.microsoft.com/office/drawing/2016/5/13/chartex" xmlns:cx8="http://schemas.microsoft.com/office/drawing/2016/5/14/chartex" xmlns:mc="http://schemas.openxmlformats.org/markup-compatibility/2006" xmlns:aink="http://schemas.microsoft.com/office/drawing/2016/ink" xmlns:am3d="http://schemas.microsoft.com/office/drawing/2017/model3d" xmlns:o="urn:schemas-microsoft-com:office:office" xmlns:oel="http://schemas.microsoft.com/office/2019/extlst" xmlns:r="http://schemas.openxmlformats.org/officeDocument/2006/relationships" xmlns:m="http://schemas.openxmlformats.org/officeDocument/2006/math" xmlns:v="urn:schemas-microsoft-com:vml" xmlns:wp14="http://schemas.microsoft.com/office/word/2010/wordprocessingDrawing" xmlns:wp="http://schemas.openxmlformats.org/drawingml/2006/wordprocessingDrawing" xmlns:w10="urn:schemas-microsoft-com:office:word" xmlns:w="http://schemas.openxmlformats.org/wordprocessingml/2006/main" xmlns:w14="http://schemas.microsoft.com/office/word/2010/wordml" xmlns:w15="http://schemas.microsoft.com/office/word/2012/wordml" xmlns:w16cex="http://schemas.microsoft.com/office/word/2018/wordml/cex" xmlns:w16cid="http://schemas.microsoft.com/office/word/2016/wordml/cid" xmlns:w16="http://schemas.microsoft.com/office/word/2018/wordml" xmlns:w16du="http://schemas.microsoft.com/office/word/2023/wordml/word16du" xmlns:w16sdtdh="http://schemas.microsoft.com/office/word/2020/wordml/sdtdatahash" xmlns:w16sdtfl="http://schemas.microsoft.com/office/word/2024/wordml/sdtformatlock" xmlns:w16se="http://schemas.microsoft.com/office/word/2015/wordml/symex" xmlns:wpg="http://schemas.microsoft.com/office/word/2010/wordprocessingGroup" xmlns:wpi="http://schemas.microsoft.com/office/word/2010/wordprocessingInk" xmlns:wne="http://schemas.microsoft.com/office/word/2006/wordml" xmlns:wps="http://schemas.microsoft.com/office/word/2010/wordprocessingShape" mc:Ignorable="w14 w15 w16se w16cid w16 w16cex w16sdtdh w16sdtfl w16du wp14">
   <w:sdt>
     <w:sdtPr>
       <w:rPr>
@@ -3605,7 +4240,7 @@
 </file>
 
 <file path=word/footer2.xml><?xml version="1.0" encoding="utf-8"?>
-<w:ftr xmlns:wpc="http://schemas.microsoft.com/office/word/2010/wordprocessingCanvas" xmlns:cx="http://schemas.microsoft.com/office/drawing/2014/chartex" xmlns:cx1="http://schemas.microsoft.com/office/drawing/2015/9/8/chartex" xmlns:cx2="http://schemas.microsoft.com/office/drawing/2015/10/21/chartex" xmlns:cx3="http://schemas.microsoft.com/office/drawing/2016/5/9/chartex" xmlns:cx4="http://schemas.microsoft.com/office/drawing/2016/5/10/chartex" xmlns:cx5="http://schemas.microsoft.com/office/drawing/2016/5/11/chartex" xmlns:cx6="http://schemas.microsoft.com/office/drawing/2016/5/12/chartex" xmlns:cx7="http://schemas.microsoft.com/office/drawing/2016/5/13/chartex" xmlns:cx8="http://schemas.microsoft.com/office/drawing/2016/5/14/chartex" xmlns:mc="http://schemas.openxmlformats.org/markup-compatibility/2006" xmlns:aink="http://schemas.microsoft.com/office/drawing/2016/ink" xmlns:am3d="http://schemas.microsoft.com/office/drawing/2017/model3d" xmlns:o="urn:schemas-microsoft-com:office:office" xmlns:oel="http://schemas.microsoft.com/office/2019/extlst" xmlns:r="http://schemas.openxmlformats.org/officeDocument/2006/relationships" xmlns:m="http://schemas.openxmlformats.org/officeDocument/2006/math" xmlns:v="urn:schemas-microsoft-com:vml" xmlns:wp14="http://schemas.microsoft.com/office/word/2010/wordprocessingDrawing" xmlns:wp="http://schemas.openxmlformats.org/drawingml/2006/wordprocessingDrawing" xmlns:w10="urn:schemas-microsoft-com:office:word" xmlns:w="http://schemas.openxmlformats.org/wordprocessingml/2006/main" xmlns:w14="http://schemas.microsoft.com/office/word/2010/wordml" xmlns:w15="http://schemas.microsoft.com/office/word/2012/wordml" xmlns:w16cex="http://schemas.microsoft.com/office/word/2018/wordml/cex" xmlns:w16cid="http://schemas.microsoft.com/office/word/2016/wordml/cid" xmlns:w16="http://schemas.microsoft.com/office/word/2018/wordml" xmlns:w16du="http://schemas.microsoft.com/office/word/2023/wordml/word16du" xmlns:w16sdtdh="http://schemas.microsoft.com/office/word/2020/wordml/sdtdatahash" xmlns:w16se="http://schemas.microsoft.com/office/word/2015/wordml/symex" xmlns:wpg="http://schemas.microsoft.com/office/word/2010/wordprocessingGroup" xmlns:wpi="http://schemas.microsoft.com/office/word/2010/wordprocessingInk" xmlns:wne="http://schemas.microsoft.com/office/word/2006/wordml" xmlns:wps="http://schemas.microsoft.com/office/word/2010/wordprocessingShape" mc:Ignorable="w14 w15 w16se w16cid w16 w16cex w16sdtdh w16du wp14">
+<w:ftr xmlns:wpc="http://schemas.microsoft.com/office/word/2010/wordprocessingCanvas" xmlns:cx="http://schemas.microsoft.com/office/drawing/2014/chartex" xmlns:cx1="http://schemas.microsoft.com/office/drawing/2015/9/8/chartex" xmlns:cx2="http://schemas.microsoft.com/office/drawing/2015/10/21/chartex" xmlns:cx3="http://schemas.microsoft.com/office/drawing/2016/5/9/chartex" xmlns:cx4="http://schemas.microsoft.com/office/drawing/2016/5/10/chartex" xmlns:cx5="http://schemas.microsoft.com/office/drawing/2016/5/11/chartex" xmlns:cx6="http://schemas.microsoft.com/office/drawing/2016/5/12/chartex" xmlns:cx7="http://schemas.microsoft.com/office/drawing/2016/5/13/chartex" xmlns:cx8="http://schemas.microsoft.com/office/drawing/2016/5/14/chartex" xmlns:mc="http://schemas.openxmlformats.org/markup-compatibility/2006" xmlns:aink="http://schemas.microsoft.com/office/drawing/2016/ink" xmlns:am3d="http://schemas.microsoft.com/office/drawing/2017/model3d" xmlns:o="urn:schemas-microsoft-com:office:office" xmlns:oel="http://schemas.microsoft.com/office/2019/extlst" xmlns:r="http://schemas.openxmlformats.org/officeDocument/2006/relationships" xmlns:m="http://schemas.openxmlformats.org/officeDocument/2006/math" xmlns:v="urn:schemas-microsoft-com:vml" xmlns:wp14="http://schemas.microsoft.com/office/word/2010/wordprocessingDrawing" xmlns:wp="http://schemas.openxmlformats.org/drawingml/2006/wordprocessingDrawing" xmlns:w10="urn:schemas-microsoft-com:office:word" xmlns:w="http://schemas.openxmlformats.org/wordprocessingml/2006/main" xmlns:w14="http://schemas.microsoft.com/office/word/2010/wordml" xmlns:w15="http://schemas.microsoft.com/office/word/2012/wordml" xmlns:w16cex="http://schemas.microsoft.com/office/word/2018/wordml/cex" xmlns:w16cid="http://schemas.microsoft.com/office/word/2016/wordml/cid" xmlns:w16="http://schemas.microsoft.com/office/word/2018/wordml" xmlns:w16du="http://schemas.microsoft.com/office/word/2023/wordml/word16du" xmlns:w16sdtdh="http://schemas.microsoft.com/office/word/2020/wordml/sdtdatahash" xmlns:w16sdtfl="http://schemas.microsoft.com/office/word/2024/wordml/sdtformatlock" xmlns:w16se="http://schemas.microsoft.com/office/word/2015/wordml/symex" xmlns:wpg="http://schemas.microsoft.com/office/word/2010/wordprocessingGroup" xmlns:wpi="http://schemas.microsoft.com/office/word/2010/wordprocessingInk" xmlns:wne="http://schemas.microsoft.com/office/word/2006/wordml" xmlns:wps="http://schemas.microsoft.com/office/word/2010/wordprocessingShape" mc:Ignorable="w14 w15 w16se w16cid w16 w16cex w16sdtdh w16sdtfl w16du wp14">
   <w:sdt>
     <w:sdtPr>
       <w:rPr>
@@ -3755,7 +4390,7 @@
 </file>
 
 <file path=word/footer3.xml><?xml version="1.0" encoding="utf-8"?>
-<w:ftr xmlns:wpc="http://schemas.microsoft.com/office/word/2010/wordprocessingCanvas" xmlns:cx="http://schemas.microsoft.com/office/drawing/2014/chartex" xmlns:cx1="http://schemas.microsoft.com/office/drawing/2015/9/8/chartex" xmlns:cx2="http://schemas.microsoft.com/office/drawing/2015/10/21/chartex" xmlns:cx3="http://schemas.microsoft.com/office/drawing/2016/5/9/chartex" xmlns:cx4="http://schemas.microsoft.com/office/drawing/2016/5/10/chartex" xmlns:cx5="http://schemas.microsoft.com/office/drawing/2016/5/11/chartex" xmlns:cx6="http://schemas.microsoft.com/office/drawing/2016/5/12/chartex" xmlns:cx7="http://schemas.microsoft.com/office/drawing/2016/5/13/chartex" xmlns:cx8="http://schemas.microsoft.com/office/drawing/2016/5/14/chartex" xmlns:mc="http://schemas.openxmlformats.org/markup-compatibility/2006" xmlns:aink="http://schemas.microsoft.com/office/drawing/2016/ink" xmlns:am3d="http://schemas.microsoft.com/office/drawing/2017/model3d" xmlns:o="urn:schemas-microsoft-com:office:office" xmlns:oel="http://schemas.microsoft.com/office/2019/extlst" xmlns:r="http://schemas.openxmlformats.org/officeDocument/2006/relationships" xmlns:m="http://schemas.openxmlformats.org/officeDocument/2006/math" xmlns:v="urn:schemas-microsoft-com:vml" xmlns:wp14="http://schemas.microsoft.com/office/word/2010/wordprocessingDrawing" xmlns:wp="http://schemas.openxmlformats.org/drawingml/2006/wordprocessingDrawing" xmlns:w10="urn:schemas-microsoft-com:office:word" xmlns:w="http://schemas.openxmlformats.org/wordprocessingml/2006/main" xmlns:w14="http://schemas.microsoft.com/office/word/2010/wordml" xmlns:w15="http://schemas.microsoft.com/office/word/2012/wordml" xmlns:w16cex="http://schemas.microsoft.com/office/word/2018/wordml/cex" xmlns:w16cid="http://schemas.microsoft.com/office/word/2016/wordml/cid" xmlns:w16="http://schemas.microsoft.com/office/word/2018/wordml" xmlns:w16du="http://schemas.microsoft.com/office/word/2023/wordml/word16du" xmlns:w16sdtdh="http://schemas.microsoft.com/office/word/2020/wordml/sdtdatahash" xmlns:w16se="http://schemas.microsoft.com/office/word/2015/wordml/symex" xmlns:wpg="http://schemas.microsoft.com/office/word/2010/wordprocessingGroup" xmlns:wpi="http://schemas.microsoft.com/office/word/2010/wordprocessingInk" xmlns:wne="http://schemas.microsoft.com/office/word/2006/wordml" xmlns:wps="http://schemas.microsoft.com/office/word/2010/wordprocessingShape" mc:Ignorable="w14 w15 w16se w16cid w16 w16cex w16sdtdh w16du wp14">
+<w:ftr xmlns:wpc="http://schemas.microsoft.com/office/word/2010/wordprocessingCanvas" xmlns:cx="http://schemas.microsoft.com/office/drawing/2014/chartex" xmlns:cx1="http://schemas.microsoft.com/office/drawing/2015/9/8/chartex" xmlns:cx2="http://schemas.microsoft.com/office/drawing/2015/10/21/chartex" xmlns:cx3="http://schemas.microsoft.com/office/drawing/2016/5/9/chartex" xmlns:cx4="http://schemas.microsoft.com/office/drawing/2016/5/10/chartex" xmlns:cx5="http://schemas.microsoft.com/office/drawing/2016/5/11/chartex" xmlns:cx6="http://schemas.microsoft.com/office/drawing/2016/5/12/chartex" xmlns:cx7="http://schemas.microsoft.com/office/drawing/2016/5/13/chartex" xmlns:cx8="http://schemas.microsoft.com/office/drawing/2016/5/14/chartex" xmlns:mc="http://schemas.openxmlformats.org/markup-compatibility/2006" xmlns:aink="http://schemas.microsoft.com/office/drawing/2016/ink" xmlns:am3d="http://schemas.microsoft.com/office/drawing/2017/model3d" xmlns:o="urn:schemas-microsoft-com:office:office" xmlns:oel="http://schemas.microsoft.com/office/2019/extlst" xmlns:r="http://schemas.openxmlformats.org/officeDocument/2006/relationships" xmlns:m="http://schemas.openxmlformats.org/officeDocument/2006/math" xmlns:v="urn:schemas-microsoft-com:vml" xmlns:wp14="http://schemas.microsoft.com/office/word/2010/wordprocessingDrawing" xmlns:wp="http://schemas.openxmlformats.org/drawingml/2006/wordprocessingDrawing" xmlns:w10="urn:schemas-microsoft-com:office:word" xmlns:w="http://schemas.openxmlformats.org/wordprocessingml/2006/main" xmlns:w14="http://schemas.microsoft.com/office/word/2010/wordml" xmlns:w15="http://schemas.microsoft.com/office/word/2012/wordml" xmlns:w16cex="http://schemas.microsoft.com/office/word/2018/wordml/cex" xmlns:w16cid="http://schemas.microsoft.com/office/word/2016/wordml/cid" xmlns:w16="http://schemas.microsoft.com/office/word/2018/wordml" xmlns:w16du="http://schemas.microsoft.com/office/word/2023/wordml/word16du" xmlns:w16sdtdh="http://schemas.microsoft.com/office/word/2020/wordml/sdtdatahash" xmlns:w16sdtfl="http://schemas.microsoft.com/office/word/2024/wordml/sdtformatlock" xmlns:w16se="http://schemas.microsoft.com/office/word/2015/wordml/symex" xmlns:wpg="http://schemas.microsoft.com/office/word/2010/wordprocessingGroup" xmlns:wpi="http://schemas.microsoft.com/office/word/2010/wordprocessingInk" xmlns:wne="http://schemas.microsoft.com/office/word/2006/wordml" xmlns:wps="http://schemas.microsoft.com/office/word/2010/wordprocessingShape" mc:Ignorable="w14 w15 w16se w16cid w16 w16cex w16sdtdh w16sdtfl w16du wp14">
   <w:sdt>
     <w:sdtPr>
       <w:rPr>
@@ -3843,7 +4478,7 @@
 </file>
 
 <file path=word/footnotes.xml><?xml version="1.0" encoding="utf-8"?>
-<w:footnotes xmlns:wpc="http://schemas.microsoft.com/office/word/2010/wordprocessingCanvas" xmlns:cx="http://schemas.microsoft.com/office/drawing/2014/chartex" xmlns:cx1="http://schemas.microsoft.com/office/drawing/2015/9/8/chartex" xmlns:cx2="http://schemas.microsoft.com/office/drawing/2015/10/21/chartex" xmlns:cx3="http://schemas.microsoft.com/office/drawing/2016/5/9/chartex" xmlns:cx4="http://schemas.microsoft.com/office/drawing/2016/5/10/chartex" xmlns:cx5="http://schemas.microsoft.com/office/drawing/2016/5/11/chartex" xmlns:cx6="http://schemas.microsoft.com/office/drawing/2016/5/12/chartex" xmlns:cx7="http://schemas.microsoft.com/office/drawing/2016/5/13/chartex" xmlns:cx8="http://schemas.microsoft.com/office/drawing/2016/5/14/chartex" xmlns:mc="http://schemas.openxmlformats.org/markup-compatibility/2006" xmlns:aink="http://schemas.microsoft.com/office/drawing/2016/ink" xmlns:am3d="http://schemas.microsoft.com/office/drawing/2017/model3d" xmlns:o="urn:schemas-microsoft-com:office:office" xmlns:oel="http://schemas.microsoft.com/office/2019/extlst" xmlns:r="http://schemas.openxmlformats.org/officeDocument/2006/relationships" xmlns:m="http://schemas.openxmlformats.org/officeDocument/2006/math" xmlns:v="urn:schemas-microsoft-com:vml" xmlns:wp14="http://schemas.microsoft.com/office/word/2010/wordprocessingDrawing" xmlns:wp="http://schemas.openxmlformats.org/drawingml/2006/wordprocessingDrawing" xmlns:w10="urn:schemas-microsoft-com:office:word" xmlns:w="http://schemas.openxmlformats.org/wordprocessingml/2006/main" xmlns:w14="http://schemas.microsoft.com/office/word/2010/wordml" xmlns:w15="http://schemas.microsoft.com/office/word/2012/wordml" xmlns:w16cex="http://schemas.microsoft.com/office/word/2018/wordml/cex" xmlns:w16cid="http://schemas.microsoft.com/office/word/2016/wordml/cid" xmlns:w16="http://schemas.microsoft.com/office/word/2018/wordml" xmlns:w16du="http://schemas.microsoft.com/office/word/2023/wordml/word16du" xmlns:w16sdtdh="http://schemas.microsoft.com/office/word/2020/wordml/sdtdatahash" xmlns:w16se="http://schemas.microsoft.com/office/word/2015/wordml/symex" xmlns:wpg="http://schemas.microsoft.com/office/word/2010/wordprocessingGroup" xmlns:wpi="http://schemas.microsoft.com/office/word/2010/wordprocessingInk" xmlns:wne="http://schemas.microsoft.com/office/word/2006/wordml" xmlns:wps="http://schemas.microsoft.com/office/word/2010/wordprocessingShape" mc:Ignorable="w14 w15 w16se w16cid w16 w16cex w16sdtdh w16du wp14">
+<w:footnotes xmlns:wpc="http://schemas.microsoft.com/office/word/2010/wordprocessingCanvas" xmlns:cx="http://schemas.microsoft.com/office/drawing/2014/chartex" xmlns:cx1="http://schemas.microsoft.com/office/drawing/2015/9/8/chartex" xmlns:cx2="http://schemas.microsoft.com/office/drawing/2015/10/21/chartex" xmlns:cx3="http://schemas.microsoft.com/office/drawing/2016/5/9/chartex" xmlns:cx4="http://schemas.microsoft.com/office/drawing/2016/5/10/chartex" xmlns:cx5="http://schemas.microsoft.com/office/drawing/2016/5/11/chartex" xmlns:cx6="http://schemas.microsoft.com/office/drawing/2016/5/12/chartex" xmlns:cx7="http://schemas.microsoft.com/office/drawing/2016/5/13/chartex" xmlns:cx8="http://schemas.microsoft.com/office/drawing/2016/5/14/chartex" xmlns:mc="http://schemas.openxmlformats.org/markup-compatibility/2006" xmlns:aink="http://schemas.microsoft.com/office/drawing/2016/ink" xmlns:am3d="http://schemas.microsoft.com/office/drawing/2017/model3d" xmlns:o="urn:schemas-microsoft-com:office:office" xmlns:oel="http://schemas.microsoft.com/office/2019/extlst" xmlns:r="http://schemas.openxmlformats.org/officeDocument/2006/relationships" xmlns:m="http://schemas.openxmlformats.org/officeDocument/2006/math" xmlns:v="urn:schemas-microsoft-com:vml" xmlns:wp14="http://schemas.microsoft.com/office/word/2010/wordprocessingDrawing" xmlns:wp="http://schemas.openxmlformats.org/drawingml/2006/wordprocessingDrawing" xmlns:w10="urn:schemas-microsoft-com:office:word" xmlns:w="http://schemas.openxmlformats.org/wordprocessingml/2006/main" xmlns:w14="http://schemas.microsoft.com/office/word/2010/wordml" xmlns:w15="http://schemas.microsoft.com/office/word/2012/wordml" xmlns:w16cex="http://schemas.microsoft.com/office/word/2018/wordml/cex" xmlns:w16cid="http://schemas.microsoft.com/office/word/2016/wordml/cid" xmlns:w16="http://schemas.microsoft.com/office/word/2018/wordml" xmlns:w16du="http://schemas.microsoft.com/office/word/2023/wordml/word16du" xmlns:w16sdtdh="http://schemas.microsoft.com/office/word/2020/wordml/sdtdatahash" xmlns:w16sdtfl="http://schemas.microsoft.com/office/word/2024/wordml/sdtformatlock" xmlns:w16se="http://schemas.microsoft.com/office/word/2015/wordml/symex" xmlns:wpg="http://schemas.microsoft.com/office/word/2010/wordprocessingGroup" xmlns:wpi="http://schemas.microsoft.com/office/word/2010/wordprocessingInk" xmlns:wne="http://schemas.microsoft.com/office/word/2006/wordml" xmlns:wps="http://schemas.microsoft.com/office/word/2010/wordprocessingShape" mc:Ignorable="w14 w15 w16se w16cid w16 w16cex w16sdtdh w16sdtfl w16du wp14">
   <w:footnote w:type="separator" w:id="-1">
     <w:p>
       <w:r>
@@ -3862,8 +4497,121 @@
 </file>
 
 <file path=word/numbering.xml><?xml version="1.0" encoding="utf-8"?>
-<w:numbering xmlns:wpc="http://schemas.microsoft.com/office/word/2010/wordprocessingCanvas" xmlns:cx="http://schemas.microsoft.com/office/drawing/2014/chartex" xmlns:cx1="http://schemas.microsoft.com/office/drawing/2015/9/8/chartex" xmlns:cx2="http://schemas.microsoft.com/office/drawing/2015/10/21/chartex" xmlns:cx3="http://schemas.microsoft.com/office/drawing/2016/5/9/chartex" xmlns:cx4="http://schemas.microsoft.com/office/drawing/2016/5/10/chartex" xmlns:cx5="http://schemas.microsoft.com/office/drawing/2016/5/11/chartex" xmlns:cx6="http://schemas.microsoft.com/office/drawing/2016/5/12/chartex" xmlns:cx7="http://schemas.microsoft.com/office/drawing/2016/5/13/chartex" xmlns:cx8="http://schemas.microsoft.com/office/drawing/2016/5/14/chartex" xmlns:mc="http://schemas.openxmlformats.org/markup-compatibility/2006" xmlns:aink="http://schemas.microsoft.com/office/drawing/2016/ink" xmlns:am3d="http://schemas.microsoft.com/office/drawing/2017/model3d" xmlns:o="urn:schemas-microsoft-com:office:office" xmlns:oel="http://schemas.microsoft.com/office/2019/extlst" xmlns:r="http://schemas.openxmlformats.org/officeDocument/2006/relationships" xmlns:m="http://schemas.openxmlformats.org/officeDocument/2006/math" xmlns:v="urn:schemas-microsoft-com:vml" xmlns:wp14="http://schemas.microsoft.com/office/word/2010/wordprocessingDrawing" xmlns:wp="http://schemas.openxmlformats.org/drawingml/2006/wordprocessingDrawing" xmlns:w10="urn:schemas-microsoft-com:office:word" xmlns:w="http://schemas.openxmlformats.org/wordprocessingml/2006/main" xmlns:w14="http://schemas.microsoft.com/office/word/2010/wordml" xmlns:w15="http://schemas.microsoft.com/office/word/2012/wordml" xmlns:w16cex="http://schemas.microsoft.com/office/word/2018/wordml/cex" xmlns:w16cid="http://schemas.microsoft.com/office/word/2016/wordml/cid" xmlns:w16="http://schemas.microsoft.com/office/word/2018/wordml" xmlns:w16du="http://schemas.microsoft.com/office/word/2023/wordml/word16du" xmlns:w16sdtdh="http://schemas.microsoft.com/office/word/2020/wordml/sdtdatahash" xmlns:w16se="http://schemas.microsoft.com/office/word/2015/wordml/symex" xmlns:wpg="http://schemas.microsoft.com/office/word/2010/wordprocessingGroup" xmlns:wpi="http://schemas.microsoft.com/office/word/2010/wordprocessingInk" xmlns:wne="http://schemas.microsoft.com/office/word/2006/wordml" xmlns:wps="http://schemas.microsoft.com/office/word/2010/wordprocessingShape" mc:Ignorable="w14 w15 w16se w16cid w16 w16cex w16sdtdh w16du wp14">
+<w:numbering xmlns:wpc="http://schemas.microsoft.com/office/word/2010/wordprocessingCanvas" xmlns:cx="http://schemas.microsoft.com/office/drawing/2014/chartex" xmlns:cx1="http://schemas.microsoft.com/office/drawing/2015/9/8/chartex" xmlns:cx2="http://schemas.microsoft.com/office/drawing/2015/10/21/chartex" xmlns:cx3="http://schemas.microsoft.com/office/drawing/2016/5/9/chartex" xmlns:cx4="http://schemas.microsoft.com/office/drawing/2016/5/10/chartex" xmlns:cx5="http://schemas.microsoft.com/office/drawing/2016/5/11/chartex" xmlns:cx6="http://schemas.microsoft.com/office/drawing/2016/5/12/chartex" xmlns:cx7="http://schemas.microsoft.com/office/drawing/2016/5/13/chartex" xmlns:cx8="http://schemas.microsoft.com/office/drawing/2016/5/14/chartex" xmlns:mc="http://schemas.openxmlformats.org/markup-compatibility/2006" xmlns:aink="http://schemas.microsoft.com/office/drawing/2016/ink" xmlns:am3d="http://schemas.microsoft.com/office/drawing/2017/model3d" xmlns:o="urn:schemas-microsoft-com:office:office" xmlns:oel="http://schemas.microsoft.com/office/2019/extlst" xmlns:r="http://schemas.openxmlformats.org/officeDocument/2006/relationships" xmlns:m="http://schemas.openxmlformats.org/officeDocument/2006/math" xmlns:v="urn:schemas-microsoft-com:vml" xmlns:wp14="http://schemas.microsoft.com/office/word/2010/wordprocessingDrawing" xmlns:wp="http://schemas.openxmlformats.org/drawingml/2006/wordprocessingDrawing" xmlns:w10="urn:schemas-microsoft-com:office:word" xmlns:w="http://schemas.openxmlformats.org/wordprocessingml/2006/main" xmlns:w14="http://schemas.microsoft.com/office/word/2010/wordml" xmlns:w15="http://schemas.microsoft.com/office/word/2012/wordml" xmlns:w16cex="http://schemas.microsoft.com/office/word/2018/wordml/cex" xmlns:w16cid="http://schemas.microsoft.com/office/word/2016/wordml/cid" xmlns:w16="http://schemas.microsoft.com/office/word/2018/wordml" xmlns:w16du="http://schemas.microsoft.com/office/word/2023/wordml/word16du" xmlns:w16sdtdh="http://schemas.microsoft.com/office/word/2020/wordml/sdtdatahash" xmlns:w16sdtfl="http://schemas.microsoft.com/office/word/2024/wordml/sdtformatlock" xmlns:w16se="http://schemas.microsoft.com/office/word/2015/wordml/symex" xmlns:wpg="http://schemas.microsoft.com/office/word/2010/wordprocessingGroup" xmlns:wpi="http://schemas.microsoft.com/office/word/2010/wordprocessingInk" xmlns:wne="http://schemas.microsoft.com/office/word/2006/wordml" xmlns:wps="http://schemas.microsoft.com/office/word/2010/wordprocessingShape" mc:Ignorable="w14 w15 w16se w16cid w16 w16cex w16sdtdh w16sdtfl w16du wp14">
   <w:abstractNum w:abstractNumId="0" w15:restartNumberingAfterBreak="0">
+    <w:nsid w:val="0A6859D7"/>
+    <w:multiLevelType w:val="hybridMultilevel"/>
+    <w:tmpl w:val="97DE9E0E"/>
+    <w:lvl w:ilvl="0" w:tplc="08090001">
+      <w:start w:val="1"/>
+      <w:numFmt w:val="bullet"/>
+      <w:lvlText w:val=""/>
+      <w:lvlJc w:val="left"/>
+      <w:pPr>
+        <w:ind w:left="720" w:hanging="360"/>
+      </w:pPr>
+      <w:rPr>
+        <w:rFonts w:ascii="Symbol" w:hAnsi="Symbol" w:hint="default"/>
+      </w:rPr>
+    </w:lvl>
+    <w:lvl w:ilvl="1" w:tplc="08090003" w:tentative="1">
+      <w:start w:val="1"/>
+      <w:numFmt w:val="bullet"/>
+      <w:lvlText w:val="o"/>
+      <w:lvlJc w:val="left"/>
+      <w:pPr>
+        <w:ind w:left="1440" w:hanging="360"/>
+      </w:pPr>
+      <w:rPr>
+        <w:rFonts w:ascii="Courier New" w:hAnsi="Courier New" w:cs="Courier New" w:hint="default"/>
+      </w:rPr>
+    </w:lvl>
+    <w:lvl w:ilvl="2" w:tplc="08090005" w:tentative="1">
+      <w:start w:val="1"/>
+      <w:numFmt w:val="bullet"/>
+      <w:lvlText w:val=""/>
+      <w:lvlJc w:val="left"/>
+      <w:pPr>
+        <w:ind w:left="2160" w:hanging="360"/>
+      </w:pPr>
+      <w:rPr>
+        <w:rFonts w:ascii="Wingdings" w:hAnsi="Wingdings" w:hint="default"/>
+      </w:rPr>
+    </w:lvl>
+    <w:lvl w:ilvl="3" w:tplc="08090001" w:tentative="1">
+      <w:start w:val="1"/>
+      <w:numFmt w:val="bullet"/>
+      <w:lvlText w:val=""/>
+      <w:lvlJc w:val="left"/>
+      <w:pPr>
+        <w:ind w:left="2880" w:hanging="360"/>
+      </w:pPr>
+      <w:rPr>
+        <w:rFonts w:ascii="Symbol" w:hAnsi="Symbol" w:hint="default"/>
+      </w:rPr>
+    </w:lvl>
+    <w:lvl w:ilvl="4" w:tplc="08090003" w:tentative="1">
+      <w:start w:val="1"/>
+      <w:numFmt w:val="bullet"/>
+      <w:lvlText w:val="o"/>
+      <w:lvlJc w:val="left"/>
+      <w:pPr>
+        <w:ind w:left="3600" w:hanging="360"/>
+      </w:pPr>
+      <w:rPr>
+        <w:rFonts w:ascii="Courier New" w:hAnsi="Courier New" w:cs="Courier New" w:hint="default"/>
+      </w:rPr>
+    </w:lvl>
+    <w:lvl w:ilvl="5" w:tplc="08090005" w:tentative="1">
+      <w:start w:val="1"/>
+      <w:numFmt w:val="bullet"/>
+      <w:lvlText w:val=""/>
+      <w:lvlJc w:val="left"/>
+      <w:pPr>
+        <w:ind w:left="4320" w:hanging="360"/>
+      </w:pPr>
+      <w:rPr>
+        <w:rFonts w:ascii="Wingdings" w:hAnsi="Wingdings" w:hint="default"/>
+      </w:rPr>
+    </w:lvl>
+    <w:lvl w:ilvl="6" w:tplc="08090001" w:tentative="1">
+      <w:start w:val="1"/>
+      <w:numFmt w:val="bullet"/>
+      <w:lvlText w:val=""/>
+      <w:lvlJc w:val="left"/>
+      <w:pPr>
+        <w:ind w:left="5040" w:hanging="360"/>
+      </w:pPr>
+      <w:rPr>
+        <w:rFonts w:ascii="Symbol" w:hAnsi="Symbol" w:hint="default"/>
+      </w:rPr>
+    </w:lvl>
+    <w:lvl w:ilvl="7" w:tplc="08090003" w:tentative="1">
+      <w:start w:val="1"/>
+      <w:numFmt w:val="bullet"/>
+      <w:lvlText w:val="o"/>
+      <w:lvlJc w:val="left"/>
+      <w:pPr>
+        <w:ind w:left="5760" w:hanging="360"/>
+      </w:pPr>
+      <w:rPr>
+        <w:rFonts w:ascii="Courier New" w:hAnsi="Courier New" w:cs="Courier New" w:hint="default"/>
+      </w:rPr>
+    </w:lvl>
+    <w:lvl w:ilvl="8" w:tplc="08090005" w:tentative="1">
+      <w:start w:val="1"/>
+      <w:numFmt w:val="bullet"/>
+      <w:lvlText w:val=""/>
+      <w:lvlJc w:val="left"/>
+      <w:pPr>
+        <w:ind w:left="6480" w:hanging="360"/>
+      </w:pPr>
+      <w:rPr>
+        <w:rFonts w:ascii="Wingdings" w:hAnsi="Wingdings" w:hint="default"/>
+      </w:rPr>
+    </w:lvl>
+  </w:abstractNum>
+  <w:abstractNum w:abstractNumId="1" w15:restartNumberingAfterBreak="0">
     <w:nsid w:val="0BD762A4"/>
     <w:multiLevelType w:val="hybridMultilevel"/>
     <w:tmpl w:val="FD101D62"/>
@@ -3949,7 +4697,93 @@
       </w:pPr>
     </w:lvl>
   </w:abstractNum>
-  <w:abstractNum w:abstractNumId="1" w15:restartNumberingAfterBreak="0">
+  <w:abstractNum w:abstractNumId="2" w15:restartNumberingAfterBreak="0">
+    <w:nsid w:val="0BE033A7"/>
+    <w:multiLevelType w:val="hybridMultilevel"/>
+    <w:tmpl w:val="8DF0A418"/>
+    <w:lvl w:ilvl="0" w:tplc="0809000F">
+      <w:start w:val="1"/>
+      <w:numFmt w:val="decimal"/>
+      <w:lvlText w:val="%1."/>
+      <w:lvlJc w:val="left"/>
+      <w:pPr>
+        <w:ind w:left="720" w:hanging="360"/>
+      </w:pPr>
+    </w:lvl>
+    <w:lvl w:ilvl="1" w:tplc="08090019" w:tentative="1">
+      <w:start w:val="1"/>
+      <w:numFmt w:val="lowerLetter"/>
+      <w:lvlText w:val="%2."/>
+      <w:lvlJc w:val="left"/>
+      <w:pPr>
+        <w:ind w:left="1440" w:hanging="360"/>
+      </w:pPr>
+    </w:lvl>
+    <w:lvl w:ilvl="2" w:tplc="0809001B" w:tentative="1">
+      <w:start w:val="1"/>
+      <w:numFmt w:val="lowerRoman"/>
+      <w:lvlText w:val="%3."/>
+      <w:lvlJc w:val="right"/>
+      <w:pPr>
+        <w:ind w:left="2160" w:hanging="180"/>
+      </w:pPr>
+    </w:lvl>
+    <w:lvl w:ilvl="3" w:tplc="0809000F" w:tentative="1">
+      <w:start w:val="1"/>
+      <w:numFmt w:val="decimal"/>
+      <w:lvlText w:val="%4."/>
+      <w:lvlJc w:val="left"/>
+      <w:pPr>
+        <w:ind w:left="2880" w:hanging="360"/>
+      </w:pPr>
+    </w:lvl>
+    <w:lvl w:ilvl="4" w:tplc="08090019" w:tentative="1">
+      <w:start w:val="1"/>
+      <w:numFmt w:val="lowerLetter"/>
+      <w:lvlText w:val="%5."/>
+      <w:lvlJc w:val="left"/>
+      <w:pPr>
+        <w:ind w:left="3600" w:hanging="360"/>
+      </w:pPr>
+    </w:lvl>
+    <w:lvl w:ilvl="5" w:tplc="0809001B" w:tentative="1">
+      <w:start w:val="1"/>
+      <w:numFmt w:val="lowerRoman"/>
+      <w:lvlText w:val="%6."/>
+      <w:lvlJc w:val="right"/>
+      <w:pPr>
+        <w:ind w:left="4320" w:hanging="180"/>
+      </w:pPr>
+    </w:lvl>
+    <w:lvl w:ilvl="6" w:tplc="0809000F" w:tentative="1">
+      <w:start w:val="1"/>
+      <w:numFmt w:val="decimal"/>
+      <w:lvlText w:val="%7."/>
+      <w:lvlJc w:val="left"/>
+      <w:pPr>
+        <w:ind w:left="5040" w:hanging="360"/>
+      </w:pPr>
+    </w:lvl>
+    <w:lvl w:ilvl="7" w:tplc="08090019" w:tentative="1">
+      <w:start w:val="1"/>
+      <w:numFmt w:val="lowerLetter"/>
+      <w:lvlText w:val="%8."/>
+      <w:lvlJc w:val="left"/>
+      <w:pPr>
+        <w:ind w:left="5760" w:hanging="360"/>
+      </w:pPr>
+    </w:lvl>
+    <w:lvl w:ilvl="8" w:tplc="0809001B" w:tentative="1">
+      <w:start w:val="1"/>
+      <w:numFmt w:val="lowerRoman"/>
+      <w:lvlText w:val="%9."/>
+      <w:lvlJc w:val="right"/>
+      <w:pPr>
+        <w:ind w:left="6480" w:hanging="180"/>
+      </w:pPr>
+    </w:lvl>
+  </w:abstractNum>
+  <w:abstractNum w:abstractNumId="3" w15:restartNumberingAfterBreak="0">
     <w:nsid w:val="1A96249C"/>
     <w:multiLevelType w:val="hybridMultilevel"/>
     <w:tmpl w:val="4B601A9A"/>
@@ -4035,7 +4869,96 @@
       </w:pPr>
     </w:lvl>
   </w:abstractNum>
-  <w:abstractNum w:abstractNumId="2" w15:restartNumberingAfterBreak="0">
+  <w:abstractNum w:abstractNumId="4" w15:restartNumberingAfterBreak="0">
+    <w:nsid w:val="1BC33DFF"/>
+    <w:multiLevelType w:val="hybridMultilevel"/>
+    <w:tmpl w:val="3CDAEAB4"/>
+    <w:lvl w:ilvl="0" w:tplc="08090015">
+      <w:start w:val="1"/>
+      <w:numFmt w:val="upperLetter"/>
+      <w:lvlText w:val="%1."/>
+      <w:lvlJc w:val="left"/>
+      <w:pPr>
+        <w:ind w:left="720" w:hanging="360"/>
+      </w:pPr>
+      <w:rPr>
+        <w:rFonts w:hint="default"/>
+      </w:rPr>
+    </w:lvl>
+    <w:lvl w:ilvl="1" w:tplc="08090019" w:tentative="1">
+      <w:start w:val="1"/>
+      <w:numFmt w:val="lowerLetter"/>
+      <w:lvlText w:val="%2."/>
+      <w:lvlJc w:val="left"/>
+      <w:pPr>
+        <w:ind w:left="1440" w:hanging="360"/>
+      </w:pPr>
+    </w:lvl>
+    <w:lvl w:ilvl="2" w:tplc="0809001B" w:tentative="1">
+      <w:start w:val="1"/>
+      <w:numFmt w:val="lowerRoman"/>
+      <w:lvlText w:val="%3."/>
+      <w:lvlJc w:val="right"/>
+      <w:pPr>
+        <w:ind w:left="2160" w:hanging="180"/>
+      </w:pPr>
+    </w:lvl>
+    <w:lvl w:ilvl="3" w:tplc="0809000F" w:tentative="1">
+      <w:start w:val="1"/>
+      <w:numFmt w:val="decimal"/>
+      <w:lvlText w:val="%4."/>
+      <w:lvlJc w:val="left"/>
+      <w:pPr>
+        <w:ind w:left="2880" w:hanging="360"/>
+      </w:pPr>
+    </w:lvl>
+    <w:lvl w:ilvl="4" w:tplc="08090019" w:tentative="1">
+      <w:start w:val="1"/>
+      <w:numFmt w:val="lowerLetter"/>
+      <w:lvlText w:val="%5."/>
+      <w:lvlJc w:val="left"/>
+      <w:pPr>
+        <w:ind w:left="3600" w:hanging="360"/>
+      </w:pPr>
+    </w:lvl>
+    <w:lvl w:ilvl="5" w:tplc="0809001B" w:tentative="1">
+      <w:start w:val="1"/>
+      <w:numFmt w:val="lowerRoman"/>
+      <w:lvlText w:val="%6."/>
+      <w:lvlJc w:val="right"/>
+      <w:pPr>
+        <w:ind w:left="4320" w:hanging="180"/>
+      </w:pPr>
+    </w:lvl>
+    <w:lvl w:ilvl="6" w:tplc="0809000F" w:tentative="1">
+      <w:start w:val="1"/>
+      <w:numFmt w:val="decimal"/>
+      <w:lvlText w:val="%7."/>
+      <w:lvlJc w:val="left"/>
+      <w:pPr>
+        <w:ind w:left="5040" w:hanging="360"/>
+      </w:pPr>
+    </w:lvl>
+    <w:lvl w:ilvl="7" w:tplc="08090019" w:tentative="1">
+      <w:start w:val="1"/>
+      <w:numFmt w:val="lowerLetter"/>
+      <w:lvlText w:val="%8."/>
+      <w:lvlJc w:val="left"/>
+      <w:pPr>
+        <w:ind w:left="5760" w:hanging="360"/>
+      </w:pPr>
+    </w:lvl>
+    <w:lvl w:ilvl="8" w:tplc="0809001B" w:tentative="1">
+      <w:start w:val="1"/>
+      <w:numFmt w:val="lowerRoman"/>
+      <w:lvlText w:val="%9."/>
+      <w:lvlJc w:val="right"/>
+      <w:pPr>
+        <w:ind w:left="6480" w:hanging="180"/>
+      </w:pPr>
+    </w:lvl>
+  </w:abstractNum>
+  <w:abstractNum w:abstractNumId="5" w15:restartNumberingAfterBreak="0">
     <w:nsid w:val="3C233B3A"/>
     <w:multiLevelType w:val="hybridMultilevel"/>
     <w:tmpl w:val="E4702A4C"/>
@@ -4122,19 +5045,28 @@
     </w:lvl>
   </w:abstractNum>
   <w:num w:numId="1" w16cid:durableId="731004505">
+    <w:abstractNumId w:val="3"/>
+  </w:num>
+  <w:num w:numId="2" w16cid:durableId="1992324200">
     <w:abstractNumId w:val="1"/>
   </w:num>
-  <w:num w:numId="2" w16cid:durableId="1992324200">
+  <w:num w:numId="3" w16cid:durableId="399836384">
+    <w:abstractNumId w:val="5"/>
+  </w:num>
+  <w:num w:numId="4" w16cid:durableId="196160778">
     <w:abstractNumId w:val="0"/>
   </w:num>
-  <w:num w:numId="3" w16cid:durableId="399836384">
+  <w:num w:numId="5" w16cid:durableId="937756959">
+    <w:abstractNumId w:val="4"/>
+  </w:num>
+  <w:num w:numId="6" w16cid:durableId="884373562">
     <w:abstractNumId w:val="2"/>
   </w:num>
 </w:numbering>
 </file>
 
 <file path=word/styles.xml><?xml version="1.0" encoding="utf-8"?>
-<w:styles xmlns:mc="http://schemas.openxmlformats.org/markup-compatibility/2006" xmlns:r="http://schemas.openxmlformats.org/officeDocument/2006/relationships" xmlns:w="http://schemas.openxmlformats.org/wordprocessingml/2006/main" xmlns:w14="http://schemas.microsoft.com/office/word/2010/wordml" xmlns:w15="http://schemas.microsoft.com/office/word/2012/wordml" xmlns:w16cex="http://schemas.microsoft.com/office/word/2018/wordml/cex" xmlns:w16cid="http://schemas.microsoft.com/office/word/2016/wordml/cid" xmlns:w16="http://schemas.microsoft.com/office/word/2018/wordml" xmlns:w16du="http://schemas.microsoft.com/office/word/2023/wordml/word16du" xmlns:w16sdtdh="http://schemas.microsoft.com/office/word/2020/wordml/sdtdatahash" xmlns:w16se="http://schemas.microsoft.com/office/word/2015/wordml/symex" mc:Ignorable="w14 w15 w16se w16cid w16 w16cex w16sdtdh w16du">
+<w:styles xmlns:mc="http://schemas.openxmlformats.org/markup-compatibility/2006" xmlns:r="http://schemas.openxmlformats.org/officeDocument/2006/relationships" xmlns:w="http://schemas.openxmlformats.org/wordprocessingml/2006/main" xmlns:w14="http://schemas.microsoft.com/office/word/2010/wordml" xmlns:w15="http://schemas.microsoft.com/office/word/2012/wordml" xmlns:w16cex="http://schemas.microsoft.com/office/word/2018/wordml/cex" xmlns:w16cid="http://schemas.microsoft.com/office/word/2016/wordml/cid" xmlns:w16="http://schemas.microsoft.com/office/word/2018/wordml" xmlns:w16du="http://schemas.microsoft.com/office/word/2023/wordml/word16du" xmlns:w16sdtdh="http://schemas.microsoft.com/office/word/2020/wordml/sdtdatahash" xmlns:w16sdtfl="http://schemas.microsoft.com/office/word/2024/wordml/sdtformatlock" xmlns:w16se="http://schemas.microsoft.com/office/word/2015/wordml/symex" mc:Ignorable="w14 w15 w16se w16cid w16 w16cex w16sdtdh w16sdtfl w16du">
   <w:docDefaults>
     <w:rPrDefault>
       <w:rPr>
@@ -4638,6 +5570,7 @@
   <w:style w:type="character" w:default="1" w:styleId="DefaultParagraphFont">
     <w:name w:val="Default Paragraph Font"/>
     <w:uiPriority w:val="1"/>
+    <w:semiHidden/>
     <w:unhideWhenUsed/>
   </w:style>
   <w:style w:type="table" w:default="1" w:styleId="TableNormal">
@@ -5073,7 +6006,7 @@
 </file>
 
 <file path=word/glossary/document.xml><?xml version="1.0" encoding="utf-8"?>
-<w:glossaryDocument xmlns:wpc="http://schemas.microsoft.com/office/word/2010/wordprocessingCanvas" xmlns:cx="http://schemas.microsoft.com/office/drawing/2014/chartex" xmlns:cx1="http://schemas.microsoft.com/office/drawing/2015/9/8/chartex" xmlns:cx2="http://schemas.microsoft.com/office/drawing/2015/10/21/chartex" xmlns:cx3="http://schemas.microsoft.com/office/drawing/2016/5/9/chartex" xmlns:cx4="http://schemas.microsoft.com/office/drawing/2016/5/10/chartex" xmlns:cx5="http://schemas.microsoft.com/office/drawing/2016/5/11/chartex" xmlns:cx6="http://schemas.microsoft.com/office/drawing/2016/5/12/chartex" xmlns:cx7="http://schemas.microsoft.com/office/drawing/2016/5/13/chartex" xmlns:cx8="http://schemas.microsoft.com/office/drawing/2016/5/14/chartex" xmlns:mc="http://schemas.openxmlformats.org/markup-compatibility/2006" xmlns:aink="http://schemas.microsoft.com/office/drawing/2016/ink" xmlns:am3d="http://schemas.microsoft.com/office/drawing/2017/model3d" xmlns:o="urn:schemas-microsoft-com:office:office" xmlns:oel="http://schemas.microsoft.com/office/2019/extlst" xmlns:r="http://schemas.openxmlformats.org/officeDocument/2006/relationships" xmlns:m="http://schemas.openxmlformats.org/officeDocument/2006/math" xmlns:v="urn:schemas-microsoft-com:vml" xmlns:wp14="http://schemas.microsoft.com/office/word/2010/wordprocessingDrawing" xmlns:wp="http://schemas.openxmlformats.org/drawingml/2006/wordprocessingDrawing" xmlns:w10="urn:schemas-microsoft-com:office:word" xmlns:w="http://schemas.openxmlformats.org/wordprocessingml/2006/main" xmlns:w14="http://schemas.microsoft.com/office/word/2010/wordml" xmlns:w15="http://schemas.microsoft.com/office/word/2012/wordml" xmlns:w16cex="http://schemas.microsoft.com/office/word/2018/wordml/cex" xmlns:w16cid="http://schemas.microsoft.com/office/word/2016/wordml/cid" xmlns:w16="http://schemas.microsoft.com/office/word/2018/wordml" xmlns:w16du="http://schemas.microsoft.com/office/word/2023/wordml/word16du" xmlns:w16sdtdh="http://schemas.microsoft.com/office/word/2020/wordml/sdtdatahash" xmlns:w16se="http://schemas.microsoft.com/office/word/2015/wordml/symex" xmlns:wpg="http://schemas.microsoft.com/office/word/2010/wordprocessingGroup" xmlns:wpi="http://schemas.microsoft.com/office/word/2010/wordprocessingInk" xmlns:wne="http://schemas.microsoft.com/office/word/2006/wordml" xmlns:wps="http://schemas.microsoft.com/office/word/2010/wordprocessingShape" mc:Ignorable="w14 w15 w16se w16cid w16 w16cex w16sdtdh w16du wp14">
+<w:glossaryDocument xmlns:wpc="http://schemas.microsoft.com/office/word/2010/wordprocessingCanvas" xmlns:cx="http://schemas.microsoft.com/office/drawing/2014/chartex" xmlns:cx1="http://schemas.microsoft.com/office/drawing/2015/9/8/chartex" xmlns:cx2="http://schemas.microsoft.com/office/drawing/2015/10/21/chartex" xmlns:cx3="http://schemas.microsoft.com/office/drawing/2016/5/9/chartex" xmlns:cx4="http://schemas.microsoft.com/office/drawing/2016/5/10/chartex" xmlns:cx5="http://schemas.microsoft.com/office/drawing/2016/5/11/chartex" xmlns:cx6="http://schemas.microsoft.com/office/drawing/2016/5/12/chartex" xmlns:cx7="http://schemas.microsoft.com/office/drawing/2016/5/13/chartex" xmlns:cx8="http://schemas.microsoft.com/office/drawing/2016/5/14/chartex" xmlns:mc="http://schemas.openxmlformats.org/markup-compatibility/2006" xmlns:aink="http://schemas.microsoft.com/office/drawing/2016/ink" xmlns:am3d="http://schemas.microsoft.com/office/drawing/2017/model3d" xmlns:o="urn:schemas-microsoft-com:office:office" xmlns:oel="http://schemas.microsoft.com/office/2019/extlst" xmlns:r="http://schemas.openxmlformats.org/officeDocument/2006/relationships" xmlns:m="http://schemas.openxmlformats.org/officeDocument/2006/math" xmlns:v="urn:schemas-microsoft-com:vml" xmlns:wp14="http://schemas.microsoft.com/office/word/2010/wordprocessingDrawing" xmlns:wp="http://schemas.openxmlformats.org/drawingml/2006/wordprocessingDrawing" xmlns:w10="urn:schemas-microsoft-com:office:word" xmlns:w="http://schemas.openxmlformats.org/wordprocessingml/2006/main" xmlns:w14="http://schemas.microsoft.com/office/word/2010/wordml" xmlns:w15="http://schemas.microsoft.com/office/word/2012/wordml" xmlns:w16cex="http://schemas.microsoft.com/office/word/2018/wordml/cex" xmlns:w16cid="http://schemas.microsoft.com/office/word/2016/wordml/cid" xmlns:w16="http://schemas.microsoft.com/office/word/2018/wordml" xmlns:w16du="http://schemas.microsoft.com/office/word/2023/wordml/word16du" xmlns:w16sdtdh="http://schemas.microsoft.com/office/word/2020/wordml/sdtdatahash" xmlns:w16sdtfl="http://schemas.microsoft.com/office/word/2024/wordml/sdtformatlock" xmlns:w16se="http://schemas.microsoft.com/office/word/2015/wordml/symex" xmlns:wpg="http://schemas.microsoft.com/office/word/2010/wordprocessingGroup" xmlns:wpi="http://schemas.microsoft.com/office/word/2010/wordprocessingInk" xmlns:wne="http://schemas.microsoft.com/office/word/2006/wordml" xmlns:wps="http://schemas.microsoft.com/office/word/2010/wordprocessingShape" mc:Ignorable="w14 w15 w16se w16cid w16 w16cex w16sdtdh w16sdtfl w16du wp14">
   <w:docParts>
     <w:docPart>
       <w:docPartPr>
@@ -5136,13 +6069,34 @@
 </file>
 
 <file path=word/glossary/fontTable.xml><?xml version="1.0" encoding="utf-8"?>
-<w:fonts xmlns:mc="http://schemas.openxmlformats.org/markup-compatibility/2006" xmlns:r="http://schemas.openxmlformats.org/officeDocument/2006/relationships" xmlns:w="http://schemas.openxmlformats.org/wordprocessingml/2006/main" xmlns:w14="http://schemas.microsoft.com/office/word/2010/wordml" xmlns:w15="http://schemas.microsoft.com/office/word/2012/wordml" xmlns:w16cex="http://schemas.microsoft.com/office/word/2018/wordml/cex" xmlns:w16cid="http://schemas.microsoft.com/office/word/2016/wordml/cid" xmlns:w16="http://schemas.microsoft.com/office/word/2018/wordml" xmlns:w16du="http://schemas.microsoft.com/office/word/2023/wordml/word16du" xmlns:w16sdtdh="http://schemas.microsoft.com/office/word/2020/wordml/sdtdatahash" xmlns:w16se="http://schemas.microsoft.com/office/word/2015/wordml/symex" mc:Ignorable="w14 w15 w16se w16cid w16 w16cex w16sdtdh w16du">
+<w:fonts xmlns:mc="http://schemas.openxmlformats.org/markup-compatibility/2006" xmlns:r="http://schemas.openxmlformats.org/officeDocument/2006/relationships" xmlns:w="http://schemas.openxmlformats.org/wordprocessingml/2006/main" xmlns:w14="http://schemas.microsoft.com/office/word/2010/wordml" xmlns:w15="http://schemas.microsoft.com/office/word/2012/wordml" xmlns:w16cex="http://schemas.microsoft.com/office/word/2018/wordml/cex" xmlns:w16cid="http://schemas.microsoft.com/office/word/2016/wordml/cid" xmlns:w16="http://schemas.microsoft.com/office/word/2018/wordml" xmlns:w16du="http://schemas.microsoft.com/office/word/2023/wordml/word16du" xmlns:w16sdtdh="http://schemas.microsoft.com/office/word/2020/wordml/sdtdatahash" xmlns:w16sdtfl="http://schemas.microsoft.com/office/word/2024/wordml/sdtformatlock" xmlns:w16se="http://schemas.microsoft.com/office/word/2015/wordml/symex" mc:Ignorable="w14 w15 w16se w16cid w16 w16cex w16sdtdh w16sdtfl w16du">
+  <w:font w:name="Symbol">
+    <w:panose1 w:val="05050102010706020507"/>
+    <w:charset w:val="02"/>
+    <w:family w:val="roman"/>
+    <w:pitch w:val="variable"/>
+    <w:sig w:usb0="00000000" w:usb1="10000000" w:usb2="00000000" w:usb3="00000000" w:csb0="80000000" w:csb1="00000000"/>
+  </w:font>
   <w:font w:name="Times New Roman">
     <w:panose1 w:val="02020603050405020304"/>
     <w:charset w:val="00"/>
     <w:family w:val="roman"/>
     <w:pitch w:val="variable"/>
     <w:sig w:usb0="E0002EFF" w:usb1="C000785B" w:usb2="00000009" w:usb3="00000000" w:csb0="000001FF" w:csb1="00000000"/>
+  </w:font>
+  <w:font w:name="Courier New">
+    <w:panose1 w:val="02070309020205020404"/>
+    <w:charset w:val="00"/>
+    <w:family w:val="modern"/>
+    <w:pitch w:val="fixed"/>
+    <w:sig w:usb0="E0002EFF" w:usb1="C0007843" w:usb2="00000009" w:usb3="00000000" w:csb0="000001FF" w:csb1="00000000"/>
+  </w:font>
+  <w:font w:name="Wingdings">
+    <w:panose1 w:val="05000000000000000000"/>
+    <w:charset w:val="02"/>
+    <w:family w:val="auto"/>
+    <w:pitch w:val="variable"/>
+    <w:sig w:usb0="00000000" w:usb1="10000000" w:usb2="00000000" w:usb3="00000000" w:csb0="80000000" w:csb1="00000000"/>
   </w:font>
   <w:font w:name="Georgia">
     <w:panose1 w:val="02040502050405020303"/>
@@ -5192,7 +6146,7 @@
 </file>
 
 <file path=word/glossary/settings.xml><?xml version="1.0" encoding="utf-8"?>
-<w:settings xmlns:mc="http://schemas.openxmlformats.org/markup-compatibility/2006" xmlns:o="urn:schemas-microsoft-com:office:office" xmlns:r="http://schemas.openxmlformats.org/officeDocument/2006/relationships" xmlns:m="http://schemas.openxmlformats.org/officeDocument/2006/math" xmlns:v="urn:schemas-microsoft-com:vml" xmlns:w10="urn:schemas-microsoft-com:office:word" xmlns:w="http://schemas.openxmlformats.org/wordprocessingml/2006/main" xmlns:w14="http://schemas.microsoft.com/office/word/2010/wordml" xmlns:w15="http://schemas.microsoft.com/office/word/2012/wordml" xmlns:w16cex="http://schemas.microsoft.com/office/word/2018/wordml/cex" xmlns:w16cid="http://schemas.microsoft.com/office/word/2016/wordml/cid" xmlns:w16="http://schemas.microsoft.com/office/word/2018/wordml" xmlns:w16du="http://schemas.microsoft.com/office/word/2023/wordml/word16du" xmlns:w16sdtdh="http://schemas.microsoft.com/office/word/2020/wordml/sdtdatahash" xmlns:w16se="http://schemas.microsoft.com/office/word/2015/wordml/symex" xmlns:sl="http://schemas.openxmlformats.org/schemaLibrary/2006/main" mc:Ignorable="w14 w15 w16se w16cid w16 w16cex w16sdtdh w16du">
+<w:settings xmlns:mc="http://schemas.openxmlformats.org/markup-compatibility/2006" xmlns:o="urn:schemas-microsoft-com:office:office" xmlns:r="http://schemas.openxmlformats.org/officeDocument/2006/relationships" xmlns:m="http://schemas.openxmlformats.org/officeDocument/2006/math" xmlns:v="urn:schemas-microsoft-com:vml" xmlns:w10="urn:schemas-microsoft-com:office:word" xmlns:w="http://schemas.openxmlformats.org/wordprocessingml/2006/main" xmlns:w14="http://schemas.microsoft.com/office/word/2010/wordml" xmlns:w15="http://schemas.microsoft.com/office/word/2012/wordml" xmlns:w16cex="http://schemas.microsoft.com/office/word/2018/wordml/cex" xmlns:w16cid="http://schemas.microsoft.com/office/word/2016/wordml/cid" xmlns:w16="http://schemas.microsoft.com/office/word/2018/wordml" xmlns:w16du="http://schemas.microsoft.com/office/word/2023/wordml/word16du" xmlns:w16sdtdh="http://schemas.microsoft.com/office/word/2020/wordml/sdtdatahash" xmlns:w16sdtfl="http://schemas.microsoft.com/office/word/2024/wordml/sdtformatlock" xmlns:w16se="http://schemas.microsoft.com/office/word/2015/wordml/symex" xmlns:sl="http://schemas.openxmlformats.org/schemaLibrary/2006/main" mc:Ignorable="w14 w15 w16se w16cid w16 w16cex w16sdtdh w16sdtfl w16du">
   <w:view w:val="normal"/>
   <w:defaultTabStop w:val="720"/>
   <w:characterSpacingControl w:val="doNotCompress"/>
@@ -5207,9 +6161,11 @@
   </w:compat>
   <w:rsids>
     <w:rsidRoot w:val="00716974"/>
+    <w:rsid w:val="00175330"/>
     <w:rsid w:val="00716974"/>
+    <w:rsid w:val="00A851ED"/>
     <w:rsid w:val="00BC6458"/>
-    <w:rsid w:val="00DE6EE2"/>
+    <w:rsid w:val="00E26AB4"/>
   </w:rsids>
   <m:mathPr>
     <m:mathFont m:val="Cambria Math"/>
@@ -5233,7 +6189,7 @@
 </file>
 
 <file path=word/glossary/styles.xml><?xml version="1.0" encoding="utf-8"?>
-<w:styles xmlns:mc="http://schemas.openxmlformats.org/markup-compatibility/2006" xmlns:r="http://schemas.openxmlformats.org/officeDocument/2006/relationships" xmlns:w="http://schemas.openxmlformats.org/wordprocessingml/2006/main" xmlns:w14="http://schemas.microsoft.com/office/word/2010/wordml" xmlns:w15="http://schemas.microsoft.com/office/word/2012/wordml" xmlns:w16cex="http://schemas.microsoft.com/office/word/2018/wordml/cex" xmlns:w16cid="http://schemas.microsoft.com/office/word/2016/wordml/cid" xmlns:w16="http://schemas.microsoft.com/office/word/2018/wordml" xmlns:w16du="http://schemas.microsoft.com/office/word/2023/wordml/word16du" xmlns:w16sdtdh="http://schemas.microsoft.com/office/word/2020/wordml/sdtdatahash" xmlns:w16se="http://schemas.microsoft.com/office/word/2015/wordml/symex" mc:Ignorable="w14 w15 w16se w16cid w16 w16cex w16sdtdh w16du">
+<w:styles xmlns:mc="http://schemas.openxmlformats.org/markup-compatibility/2006" xmlns:r="http://schemas.openxmlformats.org/officeDocument/2006/relationships" xmlns:w="http://schemas.openxmlformats.org/wordprocessingml/2006/main" xmlns:w14="http://schemas.microsoft.com/office/word/2010/wordml" xmlns:w15="http://schemas.microsoft.com/office/word/2012/wordml" xmlns:w16cex="http://schemas.microsoft.com/office/word/2018/wordml/cex" xmlns:w16cid="http://schemas.microsoft.com/office/word/2016/wordml/cid" xmlns:w16="http://schemas.microsoft.com/office/word/2018/wordml" xmlns:w16du="http://schemas.microsoft.com/office/word/2023/wordml/word16du" xmlns:w16sdtdh="http://schemas.microsoft.com/office/word/2020/wordml/sdtdatahash" xmlns:w16sdtfl="http://schemas.microsoft.com/office/word/2024/wordml/sdtformatlock" xmlns:w16se="http://schemas.microsoft.com/office/word/2015/wordml/symex" mc:Ignorable="w14 w15 w16se w16cid w16 w16cex w16sdtdh w16sdtfl w16du">
   <w:docDefaults>
     <w:rPrDefault>
       <w:rPr>
@@ -5684,24 +6640,6 @@
     <w:semiHidden/>
     <w:unhideWhenUsed/>
   </w:style>
-  <w:style w:type="paragraph" w:customStyle="1" w:styleId="E3978C8DC55F472E8FA1A8869661C87F">
-    <w:name w:val="E3978C8DC55F472E8FA1A8869661C87F"/>
-  </w:style>
-  <w:style w:type="paragraph" w:customStyle="1" w:styleId="599180C8F8C64857A62095DFDE231256">
-    <w:name w:val="599180C8F8C64857A62095DFDE231256"/>
-  </w:style>
-  <w:style w:type="paragraph" w:customStyle="1" w:styleId="1A325E0D1570474C817C5D0E0EA4D432">
-    <w:name w:val="1A325E0D1570474C817C5D0E0EA4D432"/>
-  </w:style>
-  <w:style w:type="paragraph" w:customStyle="1" w:styleId="419F8CC7F9CC44EB997EAECE04F59BB0">
-    <w:name w:val="419F8CC7F9CC44EB997EAECE04F59BB0"/>
-  </w:style>
-  <w:style w:type="paragraph" w:customStyle="1" w:styleId="F9CE5E3EA9D84730BD7A7BD33BB4FB5F">
-    <w:name w:val="F9CE5E3EA9D84730BD7A7BD33BB4FB5F"/>
-  </w:style>
-  <w:style w:type="paragraph" w:customStyle="1" w:styleId="8F08C2F925D542EB88F856900B02DAE7">
-    <w:name w:val="8F08C2F925D542EB88F856900B02DAE7"/>
-  </w:style>
   <w:style w:type="character" w:customStyle="1" w:styleId="Heading4Char">
     <w:name w:val="Heading 4 Char"/>
     <w:basedOn w:val="DefaultParagraphFont"/>
@@ -5718,35 +6656,8 @@
       <w14:ligatures w14:val="none"/>
     </w:rPr>
   </w:style>
-  <w:style w:type="paragraph" w:customStyle="1" w:styleId="3950C7F7FD724F639E82E1DCF6BDF63B">
-    <w:name w:val="3950C7F7FD724F639E82E1DCF6BDF63B"/>
-  </w:style>
-  <w:style w:type="paragraph" w:customStyle="1" w:styleId="Text">
-    <w:name w:val="Text"/>
-    <w:basedOn w:val="Normal"/>
-    <w:uiPriority w:val="5"/>
-    <w:qFormat/>
-    <w:pPr>
-      <w:spacing w:after="0" w:line="240" w:lineRule="auto"/>
-    </w:pPr>
-    <w:rPr>
-      <w:rFonts w:eastAsiaTheme="minorHAnsi"/>
-      <w:i/>
-      <w:color w:val="000000" w:themeColor="text1"/>
-      <w:kern w:val="0"/>
-      <w:sz w:val="28"/>
-      <w:lang w:val="en-US" w:eastAsia="en-US"/>
-      <w14:ligatures w14:val="none"/>
-    </w:rPr>
-  </w:style>
-  <w:style w:type="paragraph" w:customStyle="1" w:styleId="E6B2A888905E437BAE1C0AA66D8934C1">
-    <w:name w:val="E6B2A888905E437BAE1C0AA66D8934C1"/>
-  </w:style>
-  <w:style w:type="paragraph" w:customStyle="1" w:styleId="EE35B966072740DB8C09765493EE2226">
-    <w:name w:val="EE35B966072740DB8C09765493EE2226"/>
-  </w:style>
-  <w:style w:type="paragraph" w:customStyle="1" w:styleId="EF6BD2E494C94388A081C73EDCCDE01F">
-    <w:name w:val="EF6BD2E494C94388A081C73EDCCDE01F"/>
+  <w:style w:type="paragraph" w:customStyle="1" w:styleId="599180C8F8C64857A62095DFDE231256">
+    <w:name w:val="599180C8F8C64857A62095DFDE231256"/>
   </w:style>
   <w:style w:type="character" w:styleId="Emphasis">
     <w:name w:val="Emphasis"/>
@@ -5758,12 +6669,6 @@
       <w:iCs/>
       <w:color w:val="ED7D31" w:themeColor="accent2"/>
     </w:rPr>
-  </w:style>
-  <w:style w:type="paragraph" w:customStyle="1" w:styleId="83A9E7F0D81E4971A0DAC154C42DE284">
-    <w:name w:val="83A9E7F0D81E4971A0DAC154C42DE284"/>
-  </w:style>
-  <w:style w:type="paragraph" w:customStyle="1" w:styleId="E761114BBCBD4FABA21B2807693E0A2D">
-    <w:name w:val="E761114BBCBD4FABA21B2807693E0A2D"/>
   </w:style>
   <w:style w:type="paragraph" w:styleId="Quote">
     <w:name w:val="Quote"/>
@@ -5803,30 +6708,15 @@
       <w14:ligatures w14:val="none"/>
     </w:rPr>
   </w:style>
-  <w:style w:type="paragraph" w:customStyle="1" w:styleId="47A40D8486BA4136BB13EB4C5FB55479">
-    <w:name w:val="47A40D8486BA4136BB13EB4C5FB55479"/>
-  </w:style>
   <w:style w:type="paragraph" w:customStyle="1" w:styleId="7C488E2E29094ACEAF1DAB04089C7049">
     <w:name w:val="7C488E2E29094ACEAF1DAB04089C7049"/>
-    <w:rsid w:val="00716974"/>
-  </w:style>
-  <w:style w:type="paragraph" w:customStyle="1" w:styleId="7CE4A0A34BBB457DB97D935EFBE1FDB8">
-    <w:name w:val="7CE4A0A34BBB457DB97D935EFBE1FDB8"/>
-    <w:rsid w:val="00716974"/>
-  </w:style>
-  <w:style w:type="paragraph" w:customStyle="1" w:styleId="858E3F3DD2B242FA92FAB2B2CE289F03">
-    <w:name w:val="858E3F3DD2B242FA92FAB2B2CE289F03"/>
-    <w:rsid w:val="00716974"/>
-  </w:style>
-  <w:style w:type="paragraph" w:customStyle="1" w:styleId="175B3D589C6D4BF7839788E745281EA5">
-    <w:name w:val="175B3D589C6D4BF7839788E745281EA5"/>
     <w:rsid w:val="00716974"/>
   </w:style>
 </w:styles>
 </file>
 
 <file path=word/glossary/webSettings.xml><?xml version="1.0" encoding="utf-8"?>
-<w:webSettings xmlns:mc="http://schemas.openxmlformats.org/markup-compatibility/2006" xmlns:r="http://schemas.openxmlformats.org/officeDocument/2006/relationships" xmlns:w="http://schemas.openxmlformats.org/wordprocessingml/2006/main" xmlns:w14="http://schemas.microsoft.com/office/word/2010/wordml" xmlns:w15="http://schemas.microsoft.com/office/word/2012/wordml" xmlns:w16cex="http://schemas.microsoft.com/office/word/2018/wordml/cex" xmlns:w16cid="http://schemas.microsoft.com/office/word/2016/wordml/cid" xmlns:w16="http://schemas.microsoft.com/office/word/2018/wordml" xmlns:w16du="http://schemas.microsoft.com/office/word/2023/wordml/word16du" xmlns:w16sdtdh="http://schemas.microsoft.com/office/word/2020/wordml/sdtdatahash" xmlns:w16se="http://schemas.microsoft.com/office/word/2015/wordml/symex" mc:Ignorable="w14 w15 w16se w16cid w16 w16cex w16sdtdh w16du">
+<w:webSettings xmlns:mc="http://schemas.openxmlformats.org/markup-compatibility/2006" xmlns:r="http://schemas.openxmlformats.org/officeDocument/2006/relationships" xmlns:w="http://schemas.openxmlformats.org/wordprocessingml/2006/main" xmlns:w14="http://schemas.microsoft.com/office/word/2010/wordml" xmlns:w15="http://schemas.microsoft.com/office/word/2012/wordml" xmlns:w16cex="http://schemas.microsoft.com/office/word/2018/wordml/cex" xmlns:w16cid="http://schemas.microsoft.com/office/word/2016/wordml/cid" xmlns:w16="http://schemas.microsoft.com/office/word/2018/wordml" xmlns:w16du="http://schemas.microsoft.com/office/word/2023/wordml/word16du" xmlns:w16sdtdh="http://schemas.microsoft.com/office/word/2020/wordml/sdtdatahash" xmlns:w16sdtfl="http://schemas.microsoft.com/office/word/2024/wordml/sdtformatlock" xmlns:w16se="http://schemas.microsoft.com/office/word/2015/wordml/symex" mc:Ignorable="w14 w15 w16se w16cid w16 w16cex w16sdtdh w16sdtfl w16du">
   <w:optimizeForBrowser/>
   <w:allowPNG/>
 </w:webSettings>
@@ -6933,6 +7823,34 @@
 </file>
 
 <file path=customXml/item3.xml><?xml version="1.0" encoding="utf-8"?>
+<b:Sources xmlns:b="http://schemas.openxmlformats.org/officeDocument/2006/bibliography" xmlns="http://schemas.openxmlformats.org/officeDocument/2006/bibliography" SelectedStyle="\MLASeventhEditionOfficeOnline.xsl" StyleName="MLA" Version="7">
+  <b:Source xmlns:b="http://schemas.openxmlformats.org/officeDocument/2006/bibliography">
+    <b:Tag>Low25</b:Tag>
+    <b:SourceType>InternetSite</b:SourceType>
+    <b:Guid>{0506FA85-F218-4CEF-B150-FD37CDC454DB}</b:Guid>
+    <b:Title>Britannica</b:Title>
+    <b:Year>2025</b:Year>
+    <b:Author>
+      <b:Author>
+        <b:NameList>
+          <b:Person>
+            <b:Last>Lowood</b:Last>
+            <b:First>Henry</b:First>
+            <b:Middle>E.</b:Middle>
+          </b:Person>
+        </b:NameList>
+      </b:Author>
+    </b:Author>
+    <b:InternetSiteTitle>Britannica.com</b:InternetSiteTitle>
+    <b:Month>Feb</b:Month>
+    <b:Day>4</b:Day>
+    <b:URL>https://www.britannica.com/technology/virtual-reality</b:URL>
+    <b:RefOrder>1</b:RefOrder>
+  </b:Source>
+</b:Sources>
+</file>
+
+<file path=customXml/item4.xml><?xml version="1.0" encoding="utf-8"?>
 <ct:contentTypeSchema xmlns:ct="http://schemas.microsoft.com/office/2006/metadata/contentType" xmlns:ma="http://schemas.microsoft.com/office/2006/metadata/properties/metaAttributes" ct:_="" ma:_="" ma:contentTypeName="Document" ma:contentTypeID="0x01010079F111ED35F8CC479449609E8A0923A6" ma:contentTypeVersion="12" ma:contentTypeDescription="Create a new document." ma:contentTypeScope="" ma:versionID="fa6e671f1cd7e4d96ff9652be322dd5e">
   <xsd:schema xmlns:xsd="http://www.w3.org/2001/XMLSchema" xmlns:xs="http://www.w3.org/2001/XMLSchema" xmlns:p="http://schemas.microsoft.com/office/2006/metadata/properties" xmlns:ns2="71af3243-3dd4-4a8d-8c0d-dd76da1f02a5" xmlns:ns3="16c05727-aa75-4e4a-9b5f-8a80a1165891" targetNamespace="http://schemas.microsoft.com/office/2006/metadata/properties" ma:root="true" ma:fieldsID="4e2496f70b101db0b8013f30a071bbf7" ns2:_="" ns3:_="">
     <xsd:import namespace="71af3243-3dd4-4a8d-8c0d-dd76da1f02a5"/>
@@ -7153,34 +8071,6 @@
 </ct:contentTypeSchema>
 </file>
 
-<file path=customXml/item4.xml><?xml version="1.0" encoding="utf-8"?>
-<b:Sources xmlns:b="http://schemas.openxmlformats.org/officeDocument/2006/bibliography" xmlns="http://schemas.openxmlformats.org/officeDocument/2006/bibliography" SelectedStyle="\MLASeventhEditionOfficeOnline.xsl" StyleName="MLA" Version="7">
-  <b:Source xmlns:b="http://schemas.openxmlformats.org/officeDocument/2006/bibliography">
-    <b:Tag>Low25</b:Tag>
-    <b:SourceType>InternetSite</b:SourceType>
-    <b:Guid>{0506FA85-F218-4CEF-B150-FD37CDC454DB}</b:Guid>
-    <b:Title>Britannica</b:Title>
-    <b:Year>2025</b:Year>
-    <b:Author>
-      <b:Author>
-        <b:NameList>
-          <b:Person>
-            <b:Last>Lowood</b:Last>
-            <b:First>Henry</b:First>
-            <b:Middle>E.</b:Middle>
-          </b:Person>
-        </b:NameList>
-      </b:Author>
-    </b:Author>
-    <b:InternetSiteTitle>Britannica.com</b:InternetSiteTitle>
-    <b:Month>Feb</b:Month>
-    <b:Day>4</b:Day>
-    <b:URL>https://www.britannica.com/technology/virtual-reality</b:URL>
-    <b:RefOrder>1</b:RefOrder>
-  </b:Source>
-</b:Sources>
-</file>
-
 <file path=customXml/itemProps1.xml><?xml version="1.0" encoding="utf-8"?>
 <ds:datastoreItem xmlns:ds="http://schemas.openxmlformats.org/officeDocument/2006/customXml" ds:itemID="{EF425F07-5221-4468-81DD-0F0C28E7FD98}">
   <ds:schemaRefs>
@@ -7200,6 +8090,14 @@
 </file>
 
 <file path=customXml/itemProps3.xml><?xml version="1.0" encoding="utf-8"?>
+<ds:datastoreItem xmlns:ds="http://schemas.openxmlformats.org/officeDocument/2006/customXml" ds:itemID="{009099AA-17FB-4C25-A6FC-AC0B4E7A00C0}">
+  <ds:schemaRefs>
+    <ds:schemaRef ds:uri="http://schemas.openxmlformats.org/officeDocument/2006/bibliography"/>
+  </ds:schemaRefs>
+</ds:datastoreItem>
+</file>
+
+<file path=customXml/itemProps4.xml><?xml version="1.0" encoding="utf-8"?>
 <ds:datastoreItem xmlns:ds="http://schemas.openxmlformats.org/officeDocument/2006/customXml" ds:itemID="{507D20CB-E94B-44E8-97C3-44BC9C1AF38A}">
   <ds:schemaRefs>
     <ds:schemaRef ds:uri="http://schemas.microsoft.com/office/2006/metadata/contentType"/>
@@ -7216,12 +8114,4 @@
     <ds:schemaRef ds:uri="http://schemas.microsoft.com/internal/obd"/>
   </ds:schemaRefs>
 </ds:datastoreItem>
-</file>
-
-<file path=customXml/itemProps4.xml><?xml version="1.0" encoding="utf-8"?>
-<ds:datastoreItem xmlns:ds="http://schemas.openxmlformats.org/officeDocument/2006/customXml" ds:itemID="{009099AA-17FB-4C25-A6FC-AC0B4E7A00C0}">
-  <ds:schemaRefs>
-    <ds:schemaRef ds:uri="http://schemas.openxmlformats.org/officeDocument/2006/bibliography"/>
-  </ds:schemaRefs>
-</ds:datastoreItem>
 </file>
</xml_diff>